<commit_message>
Dashboard is updated and Project Images are stored at the corresponding folder.
</commit_message>
<xml_diff>
--- a/3_Project_Notes/3_Dashboard Design Notes.docx
+++ b/3_Project_Notes/3_Dashboard Design Notes.docx
@@ -1026,41 +1026,16 @@
           <w:i/>
           <w:iCs/>
           <w:color w:val="156082" w:themeColor="accent1"/>
-          <w:highlight w:val="cyan"/>
-        </w:rPr>
-      </w:pPr>
-      <w:r>
-        <w:rPr>
-          <w:i/>
-          <w:iCs/>
-          <w:color w:val="156082" w:themeColor="accent1"/>
-          <w:highlight w:val="cyan"/>
-        </w:rPr>
-        <w:t>Co-occurrence matrix for patent use codes</w:t>
-      </w:r>
-    </w:p>
-    <w:p>
-      <w:pPr>
-        <w:pStyle w:val="Prrafodelista"/>
-        <w:numPr>
-          <w:ilvl w:val="1"/>
-          <w:numId w:val="10"/>
-        </w:numPr>
+          <w:highlight w:val="lightGray"/>
+        </w:rPr>
+      </w:pPr>
+      <w:r>
         <w:rPr>
           <w:i/>
           <w:iCs/>
           <w:color w:val="156082" w:themeColor="accent1"/>
           <w:highlight w:val="lightGray"/>
         </w:rPr>
-      </w:pPr>
-      <w:r>
-        <w:rPr>
-          <w:i/>
-          <w:iCs/>
-          <w:color w:val="156082" w:themeColor="accent1"/>
-          <w:highlight w:val="lightGray"/>
-        </w:rPr>
-        <w:lastRenderedPageBreak/>
         <w:t>Co-occurrence matrix for exclusivity types</w:t>
       </w:r>
     </w:p>
@@ -1076,6 +1051,7 @@
           <w:b/>
           <w:bCs/>
         </w:rPr>
+        <w:lastRenderedPageBreak/>
         <w:t>Prioritize</w:t>
       </w:r>
       <w:r>
@@ -1455,6 +1431,11 @@
       <w:r>
         <w:t>whitespace</w:t>
       </w:r>
+    </w:p>
+    <w:p>
+      <w:pPr>
+        <w:ind w:left="720"/>
+      </w:pPr>
     </w:p>
     <w:p>
       <w:pPr>
@@ -4132,330 +4113,7 @@
         <mc:AlternateContent>
           <mc:Choice Requires="wps">
             <w:drawing>
-              <wp:anchor distT="45720" distB="45720" distL="114300" distR="114300" simplePos="0" relativeHeight="251702272" behindDoc="0" locked="0" layoutInCell="1" allowOverlap="1" wp14:anchorId="1F13FA57" wp14:editId="7DFB866F">
-                <wp:simplePos x="0" y="0"/>
-                <wp:positionH relativeFrom="margin">
-                  <wp:posOffset>3773805</wp:posOffset>
-                </wp:positionH>
-                <wp:positionV relativeFrom="paragraph">
-                  <wp:posOffset>1360170</wp:posOffset>
-                </wp:positionV>
-                <wp:extent cx="3505835" cy="3674110"/>
-                <wp:effectExtent l="0" t="0" r="18415" b="21590"/>
-                <wp:wrapSquare wrapText="bothSides"/>
-                <wp:docPr id="1953080273" name="Cuadro de texto 2"/>
-                <wp:cNvGraphicFramePr>
-                  <a:graphicFrameLocks xmlns:a="http://schemas.openxmlformats.org/drawingml/2006/main"/>
-                </wp:cNvGraphicFramePr>
-                <a:graphic xmlns:a="http://schemas.openxmlformats.org/drawingml/2006/main">
-                  <a:graphicData uri="http://schemas.microsoft.com/office/word/2010/wordprocessingShape">
-                    <wps:wsp>
-                      <wps:cNvSpPr txBox="1">
-                        <a:spLocks noChangeArrowheads="1"/>
-                      </wps:cNvSpPr>
-                      <wps:spPr bwMode="auto">
-                        <a:xfrm>
-                          <a:off x="0" y="0"/>
-                          <a:ext cx="3505835" cy="3674110"/>
-                        </a:xfrm>
-                        <a:prstGeom prst="rect">
-                          <a:avLst/>
-                        </a:prstGeom>
-                        <a:solidFill>
-                          <a:srgbClr val="FFFFFF"/>
-                        </a:solidFill>
-                        <a:ln w="9525">
-                          <a:solidFill>
-                            <a:schemeClr val="tx1"/>
-                          </a:solidFill>
-                          <a:miter lim="800000"/>
-                          <a:headEnd/>
-                          <a:tailEnd/>
-                        </a:ln>
-                      </wps:spPr>
-                      <wps:txbx>
-                        <w:txbxContent>
-                          <w:p>
-                            <w:pPr>
-                              <w:rPr>
-                                <w:i/>
-                                <w:iCs/>
-                                <w:color w:val="156082" w:themeColor="accent1"/>
-                              </w:rPr>
-                            </w:pPr>
-                            <w:r>
-                              <w:rPr>
-                                <w:i/>
-                                <w:iCs/>
-                                <w:color w:val="156082" w:themeColor="accent1"/>
-                              </w:rPr>
-                              <w:t>Co-o</w:t>
-                            </w:r>
-                            <w:r>
-                              <w:rPr>
-                                <w:i/>
-                                <w:iCs/>
-                                <w:color w:val="156082" w:themeColor="accent1"/>
-                              </w:rPr>
-                              <w:t>c</w:t>
-                            </w:r>
-                            <w:r>
-                              <w:rPr>
-                                <w:i/>
-                                <w:iCs/>
-                                <w:color w:val="156082" w:themeColor="accent1"/>
-                              </w:rPr>
-                              <w:t xml:space="preserve">currence matrix for </w:t>
-                            </w:r>
-                            <w:r>
-                              <w:rPr>
-                                <w:i/>
-                                <w:iCs/>
-                                <w:color w:val="156082" w:themeColor="accent1"/>
-                              </w:rPr>
-                              <w:t>Patent Use codes</w:t>
-                            </w:r>
-                            <w:r>
-                              <w:rPr>
-                                <w:i/>
-                                <w:iCs/>
-                                <w:color w:val="156082" w:themeColor="accent1"/>
-                              </w:rPr>
-                              <w:t>(</w:t>
-                            </w:r>
-                            <w:r>
-                              <w:rPr>
-                                <w:i/>
-                                <w:iCs/>
-                                <w:color w:val="156082" w:themeColor="accent1"/>
-                              </w:rPr>
-                              <w:t>Maybe we need a tooltip for explaining Patent Use codes</w:t>
-                            </w:r>
-                            <w:r>
-                              <w:rPr>
-                                <w:i/>
-                                <w:iCs/>
-                                <w:color w:val="156082" w:themeColor="accent1"/>
-                              </w:rPr>
-                              <w:t>)</w:t>
-                            </w:r>
-                          </w:p>
-                          <w:p>
-                            <w:pPr>
-                              <w:rPr>
-                                <w:sz w:val="28"/>
-                                <w:szCs w:val="28"/>
-                              </w:rPr>
-                            </w:pPr>
-                            <w:r>
-                              <w:rPr>
-                                <w:noProof/>
-                              </w:rPr>
-                              <w:drawing>
-                                <wp:inline distT="0" distB="0" distL="0" distR="0" wp14:anchorId="4FD6EC02" wp14:editId="778267F1">
-                                  <wp:extent cx="3314065" cy="3453866"/>
-                                  <wp:effectExtent l="0" t="0" r="635" b="0"/>
-                                  <wp:docPr id="2047324518" name="Imagen 1" descr="Imagen que contiene Calendario&#10;&#10;El contenido generado por IA puede ser incorrecto."/>
-                                  <wp:cNvGraphicFramePr>
-                                    <a:graphicFrameLocks xmlns:a="http://schemas.openxmlformats.org/drawingml/2006/main" noChangeAspect="1"/>
-                                  </wp:cNvGraphicFramePr>
-                                  <a:graphic xmlns:a="http://schemas.openxmlformats.org/drawingml/2006/main">
-                                    <a:graphicData uri="http://schemas.openxmlformats.org/drawingml/2006/picture">
-                                      <pic:pic xmlns:pic="http://schemas.openxmlformats.org/drawingml/2006/picture">
-                                        <pic:nvPicPr>
-                                          <pic:cNvPr id="1071435343" name="Imagen 1" descr="Imagen que contiene Calendario&#10;&#10;El contenido generado por IA puede ser incorrecto."/>
-                                          <pic:cNvPicPr/>
-                                        </pic:nvPicPr>
-                                        <pic:blipFill>
-                                          <a:blip r:embed="rId9"/>
-                                          <a:stretch>
-                                            <a:fillRect/>
-                                          </a:stretch>
-                                        </pic:blipFill>
-                                        <pic:spPr>
-                                          <a:xfrm>
-                                            <a:off x="0" y="0"/>
-                                            <a:ext cx="3314065" cy="3453866"/>
-                                          </a:xfrm>
-                                          <a:prstGeom prst="rect">
-                                            <a:avLst/>
-                                          </a:prstGeom>
-                                        </pic:spPr>
-                                      </pic:pic>
-                                    </a:graphicData>
-                                  </a:graphic>
-                                </wp:inline>
-                              </w:drawing>
-                            </w:r>
-                          </w:p>
-                          <w:p>
-                            <w:pPr>
-                              <w:rPr>
-                                <w:sz w:val="28"/>
-                                <w:szCs w:val="28"/>
-                              </w:rPr>
-                            </w:pPr>
-                          </w:p>
-                        </w:txbxContent>
-                      </wps:txbx>
-                      <wps:bodyPr rot="0" vert="horz" wrap="square" lIns="91440" tIns="45720" rIns="91440" bIns="45720" anchor="t" anchorCtr="0">
-                        <a:noAutofit/>
-                      </wps:bodyPr>
-                    </wps:wsp>
-                  </a:graphicData>
-                </a:graphic>
-                <wp14:sizeRelH relativeFrom="margin">
-                  <wp14:pctWidth>0</wp14:pctWidth>
-                </wp14:sizeRelH>
-                <wp14:sizeRelV relativeFrom="margin">
-                  <wp14:pctHeight>0</wp14:pctHeight>
-                </wp14:sizeRelV>
-              </wp:anchor>
-            </w:drawing>
-          </mc:Choice>
-          <mc:Fallback>
-            <w:pict>
-              <v:shape w14:anchorId="1F13FA57" id="_x0000_s1038" type="#_x0000_t202" style="position:absolute;margin-left:297.15pt;margin-top:107.1pt;width:276.05pt;height:289.3pt;z-index:251702272;visibility:visible;mso-wrap-style:square;mso-width-percent:0;mso-height-percent:0;mso-wrap-distance-left:9pt;mso-wrap-distance-top:3.6pt;mso-wrap-distance-right:9pt;mso-wrap-distance-bottom:3.6pt;mso-position-horizontal:absolute;mso-position-horizontal-relative:margin;mso-position-vertical:absolute;mso-position-vertical-relative:text;mso-width-percent:0;mso-height-percent:0;mso-width-relative:margin;mso-height-relative:margin;v-text-anchor:top" o:gfxdata="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" strokecolor="black [3213]">
-                <v:textbox>
-                  <w:txbxContent>
-                    <w:p>
-                      <w:pPr>
-                        <w:rPr>
-                          <w:i/>
-                          <w:iCs/>
-                          <w:color w:val="156082" w:themeColor="accent1"/>
-                        </w:rPr>
-                      </w:pPr>
-                      <w:r>
-                        <w:rPr>
-                          <w:i/>
-                          <w:iCs/>
-                          <w:color w:val="156082" w:themeColor="accent1"/>
-                        </w:rPr>
-                        <w:t>Co-o</w:t>
-                      </w:r>
-                      <w:r>
-                        <w:rPr>
-                          <w:i/>
-                          <w:iCs/>
-                          <w:color w:val="156082" w:themeColor="accent1"/>
-                        </w:rPr>
-                        <w:t>c</w:t>
-                      </w:r>
-                      <w:r>
-                        <w:rPr>
-                          <w:i/>
-                          <w:iCs/>
-                          <w:color w:val="156082" w:themeColor="accent1"/>
-                        </w:rPr>
-                        <w:t xml:space="preserve">currence matrix for </w:t>
-                      </w:r>
-                      <w:r>
-                        <w:rPr>
-                          <w:i/>
-                          <w:iCs/>
-                          <w:color w:val="156082" w:themeColor="accent1"/>
-                        </w:rPr>
-                        <w:t>Patent Use codes</w:t>
-                      </w:r>
-                      <w:r>
-                        <w:rPr>
-                          <w:i/>
-                          <w:iCs/>
-                          <w:color w:val="156082" w:themeColor="accent1"/>
-                        </w:rPr>
-                        <w:t>(</w:t>
-                      </w:r>
-                      <w:r>
-                        <w:rPr>
-                          <w:i/>
-                          <w:iCs/>
-                          <w:color w:val="156082" w:themeColor="accent1"/>
-                        </w:rPr>
-                        <w:t>Maybe we need a tooltip for explaining Patent Use codes</w:t>
-                      </w:r>
-                      <w:r>
-                        <w:rPr>
-                          <w:i/>
-                          <w:iCs/>
-                          <w:color w:val="156082" w:themeColor="accent1"/>
-                        </w:rPr>
-                        <w:t>)</w:t>
-                      </w:r>
-                    </w:p>
-                    <w:p>
-                      <w:pPr>
-                        <w:rPr>
-                          <w:sz w:val="28"/>
-                          <w:szCs w:val="28"/>
-                        </w:rPr>
-                      </w:pPr>
-                      <w:r>
-                        <w:rPr>
-                          <w:noProof/>
-                        </w:rPr>
-                        <w:drawing>
-                          <wp:inline distT="0" distB="0" distL="0" distR="0" wp14:anchorId="4FD6EC02" wp14:editId="778267F1">
-                            <wp:extent cx="3314065" cy="3453866"/>
-                            <wp:effectExtent l="0" t="0" r="635" b="0"/>
-                            <wp:docPr id="2047324518" name="Imagen 1" descr="Imagen que contiene Calendario&#10;&#10;El contenido generado por IA puede ser incorrecto."/>
-                            <wp:cNvGraphicFramePr>
-                              <a:graphicFrameLocks xmlns:a="http://schemas.openxmlformats.org/drawingml/2006/main" noChangeAspect="1"/>
-                            </wp:cNvGraphicFramePr>
-                            <a:graphic xmlns:a="http://schemas.openxmlformats.org/drawingml/2006/main">
-                              <a:graphicData uri="http://schemas.openxmlformats.org/drawingml/2006/picture">
-                                <pic:pic xmlns:pic="http://schemas.openxmlformats.org/drawingml/2006/picture">
-                                  <pic:nvPicPr>
-                                    <pic:cNvPr id="1071435343" name="Imagen 1" descr="Imagen que contiene Calendario&#10;&#10;El contenido generado por IA puede ser incorrecto."/>
-                                    <pic:cNvPicPr/>
-                                  </pic:nvPicPr>
-                                  <pic:blipFill>
-                                    <a:blip r:embed="rId9"/>
-                                    <a:stretch>
-                                      <a:fillRect/>
-                                    </a:stretch>
-                                  </pic:blipFill>
-                                  <pic:spPr>
-                                    <a:xfrm>
-                                      <a:off x="0" y="0"/>
-                                      <a:ext cx="3314065" cy="3453866"/>
-                                    </a:xfrm>
-                                    <a:prstGeom prst="rect">
-                                      <a:avLst/>
-                                    </a:prstGeom>
-                                  </pic:spPr>
-                                </pic:pic>
-                              </a:graphicData>
-                            </a:graphic>
-                          </wp:inline>
-                        </w:drawing>
-                      </w:r>
-                    </w:p>
-                    <w:p>
-                      <w:pPr>
-                        <w:rPr>
-                          <w:sz w:val="28"/>
-                          <w:szCs w:val="28"/>
-                        </w:rPr>
-                      </w:pPr>
-                    </w:p>
-                  </w:txbxContent>
-                </v:textbox>
-                <w10:wrap type="square" anchorx="margin"/>
-              </v:shape>
-            </w:pict>
-          </mc:Fallback>
-        </mc:AlternateContent>
-      </w:r>
-      <w:r>
-        <w:rPr>
-          <w:rFonts w:ascii="Segoe UI Emoji" w:hAnsi="Segoe UI Emoji" w:cs="Segoe UI Emoji"/>
-          <w:noProof/>
-        </w:rPr>
-        <mc:AlternateContent>
-          <mc:Choice Requires="wps">
-            <w:drawing>
-              <wp:anchor distT="45720" distB="45720" distL="114300" distR="114300" simplePos="0" relativeHeight="251700224" behindDoc="0" locked="0" layoutInCell="1" allowOverlap="1" wp14:anchorId="6E01613A" wp14:editId="079A82FA">
+              <wp:anchor distT="45720" distB="45720" distL="114300" distR="114300" simplePos="0" relativeHeight="251700224" behindDoc="0" locked="0" layoutInCell="1" allowOverlap="1" wp14:anchorId="6E01613A" wp14:editId="33F8D937">
                 <wp:simplePos x="0" y="0"/>
                 <wp:positionH relativeFrom="margin">
                   <wp:align>left</wp:align>
@@ -4463,8 +4121,8 @@
                 <wp:positionV relativeFrom="paragraph">
                   <wp:posOffset>1326515</wp:posOffset>
                 </wp:positionV>
-                <wp:extent cx="3674110" cy="3708400"/>
-                <wp:effectExtent l="0" t="0" r="21590" b="25400"/>
+                <wp:extent cx="7347585" cy="1861185"/>
+                <wp:effectExtent l="0" t="0" r="24765" b="24765"/>
                 <wp:wrapSquare wrapText="bothSides"/>
                 <wp:docPr id="2005080270" name="Cuadro de texto 2"/>
                 <wp:cNvGraphicFramePr>
@@ -4479,7 +4137,7 @@
                       <wps:spPr bwMode="auto">
                         <a:xfrm>
                           <a:off x="0" y="0"/>
-                          <a:ext cx="3674110" cy="3708400"/>
+                          <a:ext cx="7347585" cy="1861457"/>
                         </a:xfrm>
                         <a:prstGeom prst="rect">
                           <a:avLst/>
@@ -4546,9 +4204,9 @@
                                 <w:szCs w:val="28"/>
                               </w:rPr>
                               <w:drawing>
-                                <wp:inline distT="0" distB="0" distL="0" distR="0" wp14:anchorId="12E4571E" wp14:editId="2F04DAF6">
-                                  <wp:extent cx="2584800" cy="2318400"/>
-                                  <wp:effectExtent l="0" t="0" r="6350" b="5715"/>
+                                <wp:inline distT="0" distB="0" distL="0" distR="0" wp14:anchorId="12E4571E" wp14:editId="2B9AB773">
+                                  <wp:extent cx="7130143" cy="1382395"/>
+                                  <wp:effectExtent l="0" t="0" r="0" b="8255"/>
                                   <wp:docPr id="1506940352" name="Imagen 66"/>
                                   <wp:cNvGraphicFramePr>
                                     <a:graphicFrameLocks xmlns:a="http://schemas.openxmlformats.org/drawingml/2006/main" noChangeAspect="1"/>
@@ -4563,7 +4221,7 @@
                                           </pic:cNvPicPr>
                                         </pic:nvPicPr>
                                         <pic:blipFill>
-                                          <a:blip r:embed="rId10">
+                                          <a:blip r:embed="rId9">
                                             <a:extLst>
                                               <a:ext uri="{28A0092B-C50C-407E-A947-70E740481C1C}">
                                                 <a14:useLocalDpi xmlns:a14="http://schemas.microsoft.com/office/drawing/2010/main" val="0"/>
@@ -4578,7 +4236,7 @@
                                         <pic:spPr bwMode="auto">
                                           <a:xfrm>
                                             <a:off x="0" y="0"/>
-                                            <a:ext cx="2584800" cy="2318400"/>
+                                            <a:ext cx="7145182" cy="1385311"/>
                                           </a:xfrm>
                                           <a:prstGeom prst="rect">
                                             <a:avLst/>
@@ -4639,7 +4297,7 @@
           </mc:Choice>
           <mc:Fallback>
             <w:pict>
-              <v:shape w14:anchorId="6E01613A" id="_x0000_s1039" type="#_x0000_t202" style="position:absolute;margin-left:0;margin-top:104.45pt;width:289.3pt;height:292pt;z-index:251700224;visibility:visible;mso-wrap-style:square;mso-width-percent:0;mso-height-percent:0;mso-wrap-distance-left:9pt;mso-wrap-distance-top:3.6pt;mso-wrap-distance-right:9pt;mso-wrap-distance-bottom:3.6pt;mso-position-horizontal:left;mso-position-horizontal-relative:margin;mso-position-vertical:absolute;mso-position-vertical-relative:text;mso-width-percent:0;mso-height-percent:0;mso-width-relative:margin;mso-height-relative:margin;v-text-anchor:top" o:gfxdata="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" strokecolor="black [3213]">
+              <v:shape w14:anchorId="6E01613A" id="_x0000_s1038" type="#_x0000_t202" style="position:absolute;margin-left:0;margin-top:104.45pt;width:578.55pt;height:146.55pt;z-index:251700224;visibility:visible;mso-wrap-style:square;mso-width-percent:0;mso-height-percent:0;mso-wrap-distance-left:9pt;mso-wrap-distance-top:3.6pt;mso-wrap-distance-right:9pt;mso-wrap-distance-bottom:3.6pt;mso-position-horizontal:left;mso-position-horizontal-relative:margin;mso-position-vertical:absolute;mso-position-vertical-relative:text;mso-width-percent:0;mso-height-percent:0;mso-width-relative:margin;mso-height-relative:margin;v-text-anchor:top" o:gfxdata="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" strokecolor="black [3213]">
                 <v:textbox>
                   <w:txbxContent>
                     <w:p>
@@ -4690,9 +4348,9 @@
                           <w:szCs w:val="28"/>
                         </w:rPr>
                         <w:drawing>
-                          <wp:inline distT="0" distB="0" distL="0" distR="0" wp14:anchorId="12E4571E" wp14:editId="2F04DAF6">
-                            <wp:extent cx="2584800" cy="2318400"/>
-                            <wp:effectExtent l="0" t="0" r="6350" b="5715"/>
+                          <wp:inline distT="0" distB="0" distL="0" distR="0" wp14:anchorId="12E4571E" wp14:editId="2B9AB773">
+                            <wp:extent cx="7130143" cy="1382395"/>
+                            <wp:effectExtent l="0" t="0" r="0" b="8255"/>
                             <wp:docPr id="1506940352" name="Imagen 66"/>
                             <wp:cNvGraphicFramePr>
                               <a:graphicFrameLocks xmlns:a="http://schemas.openxmlformats.org/drawingml/2006/main" noChangeAspect="1"/>
@@ -4707,7 +4365,7 @@
                                     </pic:cNvPicPr>
                                   </pic:nvPicPr>
                                   <pic:blipFill>
-                                    <a:blip r:embed="rId10">
+                                    <a:blip r:embed="rId9">
                                       <a:extLst>
                                         <a:ext uri="{28A0092B-C50C-407E-A947-70E740481C1C}">
                                           <a14:useLocalDpi xmlns:a14="http://schemas.microsoft.com/office/drawing/2010/main" val="0"/>
@@ -4722,7 +4380,7 @@
                                   <pic:spPr bwMode="auto">
                                     <a:xfrm>
                                       <a:off x="0" y="0"/>
-                                      <a:ext cx="2584800" cy="2318400"/>
+                                      <a:ext cx="7145182" cy="1385311"/>
                                     </a:xfrm>
                                     <a:prstGeom prst="rect">
                                       <a:avLst/>
@@ -4780,7 +4438,7 @@
         <mc:AlternateContent>
           <mc:Choice Requires="wps">
             <w:drawing>
-              <wp:anchor distT="45720" distB="45720" distL="114300" distR="114300" simplePos="0" relativeHeight="251678720" behindDoc="0" locked="0" layoutInCell="1" allowOverlap="1" wp14:anchorId="188EF180" wp14:editId="44EA7748">
+              <wp:anchor distT="45720" distB="45720" distL="114300" distR="114300" simplePos="0" relativeHeight="251678720" behindDoc="0" locked="0" layoutInCell="1" allowOverlap="1" wp14:anchorId="188EF180" wp14:editId="0F0E8FED">
                 <wp:simplePos x="0" y="0"/>
                 <wp:positionH relativeFrom="margin">
                   <wp:posOffset>6085205</wp:posOffset>
@@ -4892,7 +4550,7 @@
           </mc:Choice>
           <mc:Fallback>
             <w:pict>
-              <v:shape w14:anchorId="188EF180" id="_x0000_s1040" type="#_x0000_t202" style="position:absolute;margin-left:479.15pt;margin-top:46.45pt;width:211.3pt;height:36.65pt;z-index:251678720;visibility:visible;mso-wrap-style:square;mso-width-percent:0;mso-height-percent:0;mso-wrap-distance-left:9pt;mso-wrap-distance-top:3.6pt;mso-wrap-distance-right:9pt;mso-wrap-distance-bottom:3.6pt;mso-position-horizontal:absolute;mso-position-horizontal-relative:margin;mso-position-vertical:absolute;mso-position-vertical-relative:text;mso-width-percent:0;mso-height-percent:0;mso-width-relative:margin;mso-height-relative:margin;v-text-anchor:top" o:gfxdata="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" stroked="f">
+              <v:shape w14:anchorId="188EF180" id="_x0000_s1039" type="#_x0000_t202" style="position:absolute;margin-left:479.15pt;margin-top:46.45pt;width:211.3pt;height:36.65pt;z-index:251678720;visibility:visible;mso-wrap-style:square;mso-width-percent:0;mso-height-percent:0;mso-wrap-distance-left:9pt;mso-wrap-distance-top:3.6pt;mso-wrap-distance-right:9pt;mso-wrap-distance-bottom:3.6pt;mso-position-horizontal:absolute;mso-position-horizontal-relative:margin;mso-position-vertical:absolute;mso-position-vertical-relative:text;mso-width-percent:0;mso-height-percent:0;mso-width-relative:margin;mso-height-relative:margin;v-text-anchor:top" o:gfxdata="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" stroked="f">
                 <v:textbox>
                   <w:txbxContent>
                     <w:p>
@@ -5043,7 +4701,7 @@
           </mc:Choice>
           <mc:Fallback>
             <w:pict>
-              <v:shape w14:anchorId="3CD57BF8" id="_x0000_s1041" type="#_x0000_t202" style="position:absolute;margin-left:14.65pt;margin-top:48.8pt;width:75.75pt;height:32.25pt;z-index:251670528;visibility:visible;mso-wrap-style:square;mso-width-percent:0;mso-height-percent:0;mso-wrap-distance-left:9pt;mso-wrap-distance-top:3.6pt;mso-wrap-distance-right:9pt;mso-wrap-distance-bottom:3.6pt;mso-position-horizontal:absolute;mso-position-horizontal-relative:margin;mso-position-vertical:absolute;mso-position-vertical-relative:text;mso-width-percent:0;mso-height-percent:0;mso-width-relative:margin;mso-height-relative:margin;v-text-anchor:top" o:gfxdata="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" stroked="f">
+              <v:shape w14:anchorId="3CD57BF8" id="_x0000_s1040" type="#_x0000_t202" style="position:absolute;margin-left:14.65pt;margin-top:48.8pt;width:75.75pt;height:32.25pt;z-index:251670528;visibility:visible;mso-wrap-style:square;mso-width-percent:0;mso-height-percent:0;mso-wrap-distance-left:9pt;mso-wrap-distance-top:3.6pt;mso-wrap-distance-right:9pt;mso-wrap-distance-bottom:3.6pt;mso-position-horizontal:absolute;mso-position-horizontal-relative:margin;mso-position-vertical:absolute;mso-position-vertical-relative:text;mso-width-percent:0;mso-height-percent:0;mso-width-relative:margin;mso-height-relative:margin;v-text-anchor:top" o:gfxdata="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" stroked="f">
                 <v:textbox>
                   <w:txbxContent>
                     <w:p>
@@ -5162,7 +4820,7 @@
           </mc:Choice>
           <mc:Fallback>
             <w:pict>
-              <v:shape w14:anchorId="4914DAC2" id="_x0000_s1042" type="#_x0000_t202" style="position:absolute;margin-left:247.15pt;margin-top:49.7pt;width:75.75pt;height:32.25pt;z-index:251674624;visibility:visible;mso-wrap-style:square;mso-width-percent:0;mso-height-percent:0;mso-wrap-distance-left:9pt;mso-wrap-distance-top:3.6pt;mso-wrap-distance-right:9pt;mso-wrap-distance-bottom:3.6pt;mso-position-horizontal:absolute;mso-position-horizontal-relative:margin;mso-position-vertical:absolute;mso-position-vertical-relative:text;mso-width-percent:0;mso-height-percent:0;mso-width-relative:margin;mso-height-relative:margin;v-text-anchor:top" o:gfxdata="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" stroked="f">
+              <v:shape w14:anchorId="4914DAC2" id="_x0000_s1041" type="#_x0000_t202" style="position:absolute;margin-left:247.15pt;margin-top:49.7pt;width:75.75pt;height:32.25pt;z-index:251674624;visibility:visible;mso-wrap-style:square;mso-width-percent:0;mso-height-percent:0;mso-wrap-distance-left:9pt;mso-wrap-distance-top:3.6pt;mso-wrap-distance-right:9pt;mso-wrap-distance-bottom:3.6pt;mso-position-horizontal:absolute;mso-position-horizontal-relative:margin;mso-position-vertical:absolute;mso-position-vertical-relative:text;mso-width-percent:0;mso-height-percent:0;mso-width-relative:margin;mso-height-relative:margin;v-text-anchor:top" o:gfxdata="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" stroked="f">
                 <v:textbox>
                   <w:txbxContent>
                     <w:p>
@@ -5282,7 +4940,7 @@
           </mc:Choice>
           <mc:Fallback>
             <w:pict>
-              <v:shape w14:anchorId="1F118B99" id="_x0000_s1043" type="#_x0000_t202" style="position:absolute;margin-left:473.65pt;margin-top:26.45pt;width:213.75pt;height:58.5pt;z-index:-251639808;visibility:visible;mso-wrap-style:square;mso-width-percent:0;mso-height-percent:0;mso-wrap-distance-left:9pt;mso-wrap-distance-top:3.6pt;mso-wrap-distance-right:9pt;mso-wrap-distance-bottom:3.6pt;mso-position-horizontal:absolute;mso-position-horizontal-relative:margin;mso-position-vertical:absolute;mso-position-vertical-relative:text;mso-width-percent:0;mso-height-percent:0;mso-width-relative:margin;mso-height-relative:margin;v-text-anchor:top" o:gfxdata="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" stroked="f">
+              <v:shape w14:anchorId="1F118B99" id="_x0000_s1042" type="#_x0000_t202" style="position:absolute;margin-left:473.65pt;margin-top:26.45pt;width:213.75pt;height:58.5pt;z-index:-251639808;visibility:visible;mso-wrap-style:square;mso-width-percent:0;mso-height-percent:0;mso-wrap-distance-left:9pt;mso-wrap-distance-top:3.6pt;mso-wrap-distance-right:9pt;mso-wrap-distance-bottom:3.6pt;mso-position-horizontal:absolute;mso-position-horizontal-relative:margin;mso-position-vertical:absolute;mso-position-vertical-relative:text;mso-width-percent:0;mso-height-percent:0;mso-width-relative:margin;mso-height-relative:margin;v-text-anchor:top" o:gfxdata="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" stroked="f">
                 <v:textbox>
                   <w:txbxContent>
                     <w:p>
@@ -5553,7 +5211,190 @@
         <mc:AlternateContent>
           <mc:Choice Requires="wps">
             <w:drawing>
-              <wp:anchor distT="45720" distB="45720" distL="114300" distR="114300" simplePos="0" relativeHeight="251698176" behindDoc="0" locked="0" layoutInCell="1" allowOverlap="1" wp14:anchorId="13300F44" wp14:editId="4A30DCC4">
+              <wp:anchor distT="45720" distB="45720" distL="114300" distR="114300" simplePos="0" relativeHeight="251782144" behindDoc="0" locked="0" layoutInCell="1" allowOverlap="1" wp14:anchorId="3854B64E" wp14:editId="76D8C63F">
+                <wp:simplePos x="0" y="0"/>
+                <wp:positionH relativeFrom="margin">
+                  <wp:align>left</wp:align>
+                </wp:positionH>
+                <wp:positionV relativeFrom="paragraph">
+                  <wp:posOffset>2981960</wp:posOffset>
+                </wp:positionV>
+                <wp:extent cx="7347585" cy="1719580"/>
+                <wp:effectExtent l="0" t="0" r="24765" b="13970"/>
+                <wp:wrapSquare wrapText="bothSides"/>
+                <wp:docPr id="659416792" name="Cuadro de texto 2"/>
+                <wp:cNvGraphicFramePr>
+                  <a:graphicFrameLocks xmlns:a="http://schemas.openxmlformats.org/drawingml/2006/main"/>
+                </wp:cNvGraphicFramePr>
+                <a:graphic xmlns:a="http://schemas.openxmlformats.org/drawingml/2006/main">
+                  <a:graphicData uri="http://schemas.microsoft.com/office/word/2010/wordprocessingShape">
+                    <wps:wsp>
+                      <wps:cNvSpPr txBox="1">
+                        <a:spLocks noChangeArrowheads="1"/>
+                      </wps:cNvSpPr>
+                      <wps:spPr bwMode="auto">
+                        <a:xfrm>
+                          <a:off x="0" y="0"/>
+                          <a:ext cx="7347585" cy="1719580"/>
+                        </a:xfrm>
+                        <a:prstGeom prst="rect">
+                          <a:avLst/>
+                        </a:prstGeom>
+                        <a:solidFill>
+                          <a:srgbClr val="FFFFFF"/>
+                        </a:solidFill>
+                        <a:ln w="9525">
+                          <a:solidFill>
+                            <a:schemeClr val="tx1"/>
+                          </a:solidFill>
+                          <a:miter lim="800000"/>
+                          <a:headEnd/>
+                          <a:tailEnd/>
+                        </a:ln>
+                      </wps:spPr>
+                      <wps:txbx>
+                        <w:txbxContent>
+                          <w:p>
+                            <w:pPr>
+                              <w:rPr>
+                                <w:i/>
+                                <w:iCs/>
+                                <w:color w:val="156082" w:themeColor="accent1"/>
+                              </w:rPr>
+                            </w:pPr>
+                            <w:r>
+                              <w:rPr>
+                                <w:i/>
+                                <w:iCs/>
+                                <w:color w:val="156082" w:themeColor="accent1"/>
+                              </w:rPr>
+                              <w:t>Patent Duration Distribution</w:t>
+                            </w:r>
+                          </w:p>
+                          <w:p>
+                            <w:pPr>
+                              <w:rPr>
+                                <w:i/>
+                                <w:iCs/>
+                                <w:color w:val="156082" w:themeColor="accent1"/>
+                              </w:rPr>
+                            </w:pPr>
+                          </w:p>
+                          <w:p>
+                            <w:pPr>
+                              <w:rPr>
+                                <w:i/>
+                                <w:iCs/>
+                                <w:color w:val="747474" w:themeColor="background2" w:themeShade="80"/>
+                              </w:rPr>
+                            </w:pPr>
+                          </w:p>
+                          <w:p>
+                            <w:pPr>
+                              <w:rPr>
+                                <w:sz w:val="28"/>
+                                <w:szCs w:val="28"/>
+                              </w:rPr>
+                            </w:pPr>
+                          </w:p>
+                          <w:p>
+                            <w:pPr>
+                              <w:rPr>
+                                <w:sz w:val="28"/>
+                                <w:szCs w:val="28"/>
+                              </w:rPr>
+                            </w:pPr>
+                          </w:p>
+                        </w:txbxContent>
+                      </wps:txbx>
+                      <wps:bodyPr rot="0" vert="horz" wrap="square" lIns="91440" tIns="45720" rIns="91440" bIns="45720" anchor="t" anchorCtr="0">
+                        <a:noAutofit/>
+                      </wps:bodyPr>
+                    </wps:wsp>
+                  </a:graphicData>
+                </a:graphic>
+                <wp14:sizeRelH relativeFrom="margin">
+                  <wp14:pctWidth>0</wp14:pctWidth>
+                </wp14:sizeRelH>
+                <wp14:sizeRelV relativeFrom="margin">
+                  <wp14:pctHeight>0</wp14:pctHeight>
+                </wp14:sizeRelV>
+              </wp:anchor>
+            </w:drawing>
+          </mc:Choice>
+          <mc:Fallback>
+            <w:pict>
+              <v:shape w14:anchorId="3854B64E" id="_x0000_s1043" type="#_x0000_t202" style="position:absolute;margin-left:0;margin-top:234.8pt;width:578.55pt;height:135.4pt;z-index:251782144;visibility:visible;mso-wrap-style:square;mso-width-percent:0;mso-height-percent:0;mso-wrap-distance-left:9pt;mso-wrap-distance-top:3.6pt;mso-wrap-distance-right:9pt;mso-wrap-distance-bottom:3.6pt;mso-position-horizontal:left;mso-position-horizontal-relative:margin;mso-position-vertical:absolute;mso-position-vertical-relative:text;mso-width-percent:0;mso-height-percent:0;mso-width-relative:margin;mso-height-relative:margin;v-text-anchor:top" o:gfxdata="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" strokecolor="black [3213]">
+                <v:textbox>
+                  <w:txbxContent>
+                    <w:p>
+                      <w:pPr>
+                        <w:rPr>
+                          <w:i/>
+                          <w:iCs/>
+                          <w:color w:val="156082" w:themeColor="accent1"/>
+                        </w:rPr>
+                      </w:pPr>
+                      <w:r>
+                        <w:rPr>
+                          <w:i/>
+                          <w:iCs/>
+                          <w:color w:val="156082" w:themeColor="accent1"/>
+                        </w:rPr>
+                        <w:t>Patent Duration Distribution</w:t>
+                      </w:r>
+                    </w:p>
+                    <w:p>
+                      <w:pPr>
+                        <w:rPr>
+                          <w:i/>
+                          <w:iCs/>
+                          <w:color w:val="156082" w:themeColor="accent1"/>
+                        </w:rPr>
+                      </w:pPr>
+                    </w:p>
+                    <w:p>
+                      <w:pPr>
+                        <w:rPr>
+                          <w:i/>
+                          <w:iCs/>
+                          <w:color w:val="747474" w:themeColor="background2" w:themeShade="80"/>
+                        </w:rPr>
+                      </w:pPr>
+                    </w:p>
+                    <w:p>
+                      <w:pPr>
+                        <w:rPr>
+                          <w:sz w:val="28"/>
+                          <w:szCs w:val="28"/>
+                        </w:rPr>
+                      </w:pPr>
+                    </w:p>
+                    <w:p>
+                      <w:pPr>
+                        <w:rPr>
+                          <w:sz w:val="28"/>
+                          <w:szCs w:val="28"/>
+                        </w:rPr>
+                      </w:pPr>
+                    </w:p>
+                  </w:txbxContent>
+                </v:textbox>
+                <w10:wrap type="square" anchorx="margin"/>
+              </v:shape>
+            </w:pict>
+          </mc:Fallback>
+        </mc:AlternateContent>
+      </w:r>
+      <w:r>
+        <w:rPr>
+          <w:rFonts w:ascii="Segoe UI Emoji" w:hAnsi="Segoe UI Emoji" w:cs="Segoe UI Emoji"/>
+          <w:noProof/>
+        </w:rPr>
+        <mc:AlternateContent>
+          <mc:Choice Requires="wps">
+            <w:drawing>
+              <wp:anchor distT="45720" distB="45720" distL="114300" distR="114300" simplePos="0" relativeHeight="251698176" behindDoc="0" locked="0" layoutInCell="1" allowOverlap="1" wp14:anchorId="13300F44" wp14:editId="7D217EC0">
                 <wp:simplePos x="0" y="0"/>
                 <wp:positionH relativeFrom="margin">
                   <wp:posOffset>7552690</wp:posOffset>
@@ -5856,108 +5697,7 @@
         <mc:AlternateContent>
           <mc:Choice Requires="wps">
             <w:drawing>
-              <wp:anchor distT="45720" distB="45720" distL="114300" distR="114300" simplePos="0" relativeHeight="251694080" behindDoc="0" locked="0" layoutInCell="1" allowOverlap="1" wp14:anchorId="4B101C3C" wp14:editId="15188A12">
-                <wp:simplePos x="0" y="0"/>
-                <wp:positionH relativeFrom="margin">
-                  <wp:posOffset>7538296</wp:posOffset>
-                </wp:positionH>
-                <wp:positionV relativeFrom="paragraph">
-                  <wp:posOffset>1352974</wp:posOffset>
-                </wp:positionV>
-                <wp:extent cx="1409700" cy="276225"/>
-                <wp:effectExtent l="0" t="0" r="19050" b="28575"/>
-                <wp:wrapSquare wrapText="bothSides"/>
-                <wp:docPr id="210600561" name="Cuadro de texto 2"/>
-                <wp:cNvGraphicFramePr>
-                  <a:graphicFrameLocks xmlns:a="http://schemas.openxmlformats.org/drawingml/2006/main"/>
-                </wp:cNvGraphicFramePr>
-                <a:graphic xmlns:a="http://schemas.openxmlformats.org/drawingml/2006/main">
-                  <a:graphicData uri="http://schemas.microsoft.com/office/word/2010/wordprocessingShape">
-                    <wps:wsp>
-                      <wps:cNvSpPr txBox="1">
-                        <a:spLocks noChangeArrowheads="1"/>
-                      </wps:cNvSpPr>
-                      <wps:spPr bwMode="auto">
-                        <a:xfrm>
-                          <a:off x="0" y="0"/>
-                          <a:ext cx="1409700" cy="276225"/>
-                        </a:xfrm>
-                        <a:prstGeom prst="rect">
-                          <a:avLst/>
-                        </a:prstGeom>
-                        <a:solidFill>
-                          <a:srgbClr val="FFFFFF"/>
-                        </a:solidFill>
-                        <a:ln w="9525">
-                          <a:solidFill>
-                            <a:srgbClr val="000000"/>
-                          </a:solidFill>
-                          <a:miter lim="800000"/>
-                          <a:headEnd/>
-                          <a:tailEnd/>
-                        </a:ln>
-                      </wps:spPr>
-                      <wps:txbx>
-                        <w:txbxContent>
-                          <w:p>
-                            <w:pPr>
-                              <w:rPr>
-                                <w:lang w:val="es-ES"/>
-                              </w:rPr>
-                            </w:pPr>
-                            <w:r>
-                              <w:t>Innovator, Generic</w:t>
-                            </w:r>
-                          </w:p>
-                        </w:txbxContent>
-                      </wps:txbx>
-                      <wps:bodyPr rot="0" vert="horz" wrap="square" lIns="91440" tIns="45720" rIns="91440" bIns="45720" anchor="t" anchorCtr="0">
-                        <a:noAutofit/>
-                      </wps:bodyPr>
-                    </wps:wsp>
-                  </a:graphicData>
-                </a:graphic>
-                <wp14:sizeRelH relativeFrom="margin">
-                  <wp14:pctWidth>0</wp14:pctWidth>
-                </wp14:sizeRelH>
-                <wp14:sizeRelV relativeFrom="margin">
-                  <wp14:pctHeight>0</wp14:pctHeight>
-                </wp14:sizeRelV>
-              </wp:anchor>
-            </w:drawing>
-          </mc:Choice>
-          <mc:Fallback>
-            <w:pict>
-              <v:shape w14:anchorId="4B101C3C" id="_x0000_s1047" type="#_x0000_t202" style="position:absolute;margin-left:593.55pt;margin-top:106.55pt;width:111pt;height:21.75pt;z-index:251694080;visibility:visible;mso-wrap-style:square;mso-width-percent:0;mso-height-percent:0;mso-wrap-distance-left:9pt;mso-wrap-distance-top:3.6pt;mso-wrap-distance-right:9pt;mso-wrap-distance-bottom:3.6pt;mso-position-horizontal:absolute;mso-position-horizontal-relative:margin;mso-position-vertical:absolute;mso-position-vertical-relative:text;mso-width-percent:0;mso-height-percent:0;mso-width-relative:margin;mso-height-relative:margin;v-text-anchor:top" o:gfxdata="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">
-                <v:textbox>
-                  <w:txbxContent>
-                    <w:p>
-                      <w:pPr>
-                        <w:rPr>
-                          <w:lang w:val="es-ES"/>
-                        </w:rPr>
-                      </w:pPr>
-                      <w:r>
-                        <w:t>Innovator, Generic</w:t>
-                      </w:r>
-                    </w:p>
-                  </w:txbxContent>
-                </v:textbox>
-                <w10:wrap type="square" anchorx="margin"/>
-              </v:shape>
-            </w:pict>
-          </mc:Fallback>
-        </mc:AlternateContent>
-      </w:r>
-      <w:r>
-        <w:rPr>
-          <w:rFonts w:ascii="Segoe UI Emoji" w:hAnsi="Segoe UI Emoji" w:cs="Segoe UI Emoji"/>
-          <w:noProof/>
-        </w:rPr>
-        <mc:AlternateContent>
-          <mc:Choice Requires="wps">
-            <w:drawing>
-              <wp:anchor distT="0" distB="0" distL="114300" distR="114300" simplePos="0" relativeHeight="251680768" behindDoc="0" locked="0" layoutInCell="1" allowOverlap="1" wp14:anchorId="2C720C96" wp14:editId="31B373FA">
+              <wp:anchor distT="0" distB="0" distL="114300" distR="114300" simplePos="0" relativeHeight="251680768" behindDoc="0" locked="0" layoutInCell="1" allowOverlap="1" wp14:anchorId="2C720C96" wp14:editId="47F352DD">
                 <wp:simplePos x="0" y="0"/>
                 <wp:positionH relativeFrom="column">
                   <wp:posOffset>7431405</wp:posOffset>
@@ -6020,7 +5760,7 @@
           </mc:Choice>
           <mc:Fallback>
             <w:pict>
-              <v:rect w14:anchorId="30CC33B4" id="Rectángulo 1" o:spid="_x0000_s1026" style="position:absolute;margin-left:585.15pt;margin-top:77.95pt;width:128.25pt;height:291.35pt;z-index:251680768;visibility:visible;mso-wrap-style:square;mso-width-percent:0;mso-height-percent:0;mso-wrap-distance-left:9pt;mso-wrap-distance-top:0;mso-wrap-distance-right:9pt;mso-wrap-distance-bottom:0;mso-position-horizontal:absolute;mso-position-horizontal-relative:text;mso-position-vertical:absolute;mso-position-vertical-relative:text;mso-width-percent:0;mso-height-percent:0;mso-width-relative:margin;mso-height-relative:margin;v-text-anchor:middle" o:gfxdata="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" filled="f" strokecolor="#030e13 [484]" strokeweight="1pt"/>
+              <v:rect w14:anchorId="29AB68A7" id="Rectángulo 1" o:spid="_x0000_s1026" style="position:absolute;margin-left:585.15pt;margin-top:77.95pt;width:128.25pt;height:291.35pt;z-index:251680768;visibility:visible;mso-wrap-style:square;mso-width-percent:0;mso-height-percent:0;mso-wrap-distance-left:9pt;mso-wrap-distance-top:0;mso-wrap-distance-right:9pt;mso-wrap-distance-bottom:0;mso-position-horizontal:absolute;mso-position-horizontal-relative:text;mso-position-vertical:absolute;mso-position-vertical-relative:text;mso-width-percent:0;mso-height-percent:0;mso-width-relative:margin;mso-height-relative:margin;v-text-anchor:middle" o:gfxdata="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" filled="f" strokecolor="#030e13 [484]" strokeweight="1pt"/>
             </w:pict>
           </mc:Fallback>
         </mc:AlternateContent>
@@ -6109,7 +5849,7 @@
           </mc:Choice>
           <mc:Fallback>
             <w:pict>
-              <v:shape w14:anchorId="143D56AF" id="_x0000_s1048" type="#_x0000_t202" style="position:absolute;margin-left:594.4pt;margin-top:79.45pt;width:84pt;height:18pt;z-index:251689984;visibility:visible;mso-wrap-style:square;mso-width-percent:0;mso-height-percent:0;mso-wrap-distance-left:9pt;mso-wrap-distance-top:3.6pt;mso-wrap-distance-right:9pt;mso-wrap-distance-bottom:3.6pt;mso-position-horizontal:absolute;mso-position-horizontal-relative:text;mso-position-vertical:absolute;mso-position-vertical-relative:text;mso-width-percent:0;mso-height-percent:0;mso-width-relative:margin;mso-height-relative:margin;v-text-anchor:top" o:gfxdata="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" stroked="f">
+              <v:shape w14:anchorId="143D56AF" id="_x0000_s1047" type="#_x0000_t202" style="position:absolute;margin-left:594.4pt;margin-top:79.45pt;width:84pt;height:18pt;z-index:251689984;visibility:visible;mso-wrap-style:square;mso-width-percent:0;mso-height-percent:0;mso-wrap-distance-left:9pt;mso-wrap-distance-top:3.6pt;mso-wrap-distance-right:9pt;mso-wrap-distance-bottom:3.6pt;mso-position-horizontal:absolute;mso-position-horizontal-relative:text;mso-position-vertical:absolute;mso-position-vertical-relative:text;mso-width-percent:0;mso-height-percent:0;mso-width-relative:margin;mso-height-relative:margin;v-text-anchor:top" o:gfxdata="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" stroked="f">
                 <v:textbox>
                   <w:txbxContent>
                     <w:p>
@@ -6231,7 +5971,7 @@
           </mc:Choice>
           <mc:Fallback>
             <w:pict>
-              <v:shape w14:anchorId="0EFCCE4C" id="_x0000_s1049" type="#_x0000_t202" style="position:absolute;margin-left:9.4pt;margin-top:.7pt;width:213.75pt;height:58.5pt;z-index:251666432;visibility:visible;mso-wrap-style:square;mso-width-percent:0;mso-height-percent:0;mso-wrap-distance-left:9pt;mso-wrap-distance-top:3.6pt;mso-wrap-distance-right:9pt;mso-wrap-distance-bottom:3.6pt;mso-position-horizontal:absolute;mso-position-horizontal-relative:text;mso-position-vertical:absolute;mso-position-vertical-relative:text;mso-width-percent:0;mso-height-percent:0;mso-width-relative:margin;mso-height-relative:margin;v-text-anchor:top" o:gfxdata="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" stroked="f">
+              <v:shape w14:anchorId="0EFCCE4C" id="_x0000_s1048" type="#_x0000_t202" style="position:absolute;margin-left:9.4pt;margin-top:.7pt;width:213.75pt;height:58.5pt;z-index:251666432;visibility:visible;mso-wrap-style:square;mso-width-percent:0;mso-height-percent:0;mso-wrap-distance-left:9pt;mso-wrap-distance-top:3.6pt;mso-wrap-distance-right:9pt;mso-wrap-distance-bottom:3.6pt;mso-position-horizontal:absolute;mso-position-horizontal-relative:text;mso-position-vertical:absolute;mso-position-vertical-relative:text;mso-width-percent:0;mso-height-percent:0;mso-width-relative:margin;mso-height-relative:margin;v-text-anchor:top" o:gfxdata="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" stroked="f">
                 <v:textbox>
                   <w:txbxContent>
                     <w:p>
@@ -6364,7 +6104,7 @@
           </mc:Choice>
           <mc:Fallback>
             <w:pict>
-              <v:shape w14:anchorId="086D11B0" id="_x0000_s1050" type="#_x0000_t202" style="position:absolute;margin-left:0;margin-top:.6pt;width:213.75pt;height:58.5pt;z-index:251668480;visibility:visible;mso-wrap-style:square;mso-width-percent:0;mso-height-percent:0;mso-wrap-distance-left:9pt;mso-wrap-distance-top:3.6pt;mso-wrap-distance-right:9pt;mso-wrap-distance-bottom:3.6pt;mso-position-horizontal:center;mso-position-horizontal-relative:margin;mso-position-vertical:absolute;mso-position-vertical-relative:text;mso-width-percent:0;mso-height-percent:0;mso-width-relative:margin;mso-height-relative:margin;v-text-anchor:top" o:gfxdata="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" stroked="f">
+              <v:shape w14:anchorId="086D11B0" id="_x0000_s1049" type="#_x0000_t202" style="position:absolute;margin-left:0;margin-top:.6pt;width:213.75pt;height:58.5pt;z-index:251668480;visibility:visible;mso-wrap-style:square;mso-width-percent:0;mso-height-percent:0;mso-wrap-distance-left:9pt;mso-wrap-distance-top:3.6pt;mso-wrap-distance-right:9pt;mso-wrap-distance-bottom:3.6pt;mso-position-horizontal:center;mso-position-horizontal-relative:margin;mso-position-vertical:absolute;mso-position-vertical-relative:text;mso-width-percent:0;mso-height-percent:0;mso-width-relative:margin;mso-height-relative:margin;v-text-anchor:top" o:gfxdata="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" stroked="f">
                 <v:textbox>
                   <w:txbxContent>
                     <w:p>
@@ -6414,6 +6154,85 @@
       <w:r>
         <w:rPr>
           <w:rFonts w:ascii="Segoe UI Emoji" w:hAnsi="Segoe UI Emoji" w:cs="Segoe UI Emoji"/>
+          <w:noProof/>
+        </w:rPr>
+        <mc:AlternateContent>
+          <mc:Choice Requires="wps">
+            <w:drawing>
+              <wp:anchor distT="0" distB="0" distL="114300" distR="114300" simplePos="0" relativeHeight="251804672" behindDoc="0" locked="0" layoutInCell="1" allowOverlap="1" wp14:anchorId="4EB39604" wp14:editId="35C96362">
+                <wp:simplePos x="0" y="0"/>
+                <wp:positionH relativeFrom="column">
+                  <wp:posOffset>3926205</wp:posOffset>
+                </wp:positionH>
+                <wp:positionV relativeFrom="paragraph">
+                  <wp:posOffset>1415415</wp:posOffset>
+                </wp:positionV>
+                <wp:extent cx="12700" cy="1562100"/>
+                <wp:effectExtent l="0" t="0" r="25400" b="19050"/>
+                <wp:wrapNone/>
+                <wp:docPr id="446825959" name="Conector recto 62"/>
+                <wp:cNvGraphicFramePr/>
+                <a:graphic xmlns:a="http://schemas.openxmlformats.org/drawingml/2006/main">
+                  <a:graphicData uri="http://schemas.microsoft.com/office/word/2010/wordprocessingShape">
+                    <wps:wsp>
+                      <wps:cNvCnPr/>
+                      <wps:spPr>
+                        <a:xfrm>
+                          <a:off x="0" y="0"/>
+                          <a:ext cx="12700" cy="1562100"/>
+                        </a:xfrm>
+                        <a:prstGeom prst="line">
+                          <a:avLst/>
+                        </a:prstGeom>
+                        <a:ln w="19050" cap="flat" cmpd="sng" algn="ctr">
+                          <a:solidFill>
+                            <a:srgbClr val="EE0000"/>
+                          </a:solidFill>
+                          <a:prstDash val="dash"/>
+                          <a:round/>
+                          <a:headEnd type="none" w="med" len="med"/>
+                          <a:tailEnd type="none" w="med" len="med"/>
+                        </a:ln>
+                      </wps:spPr>
+                      <wps:style>
+                        <a:lnRef idx="0">
+                          <a:scrgbClr r="0" g="0" b="0"/>
+                        </a:lnRef>
+                        <a:fillRef idx="0">
+                          <a:scrgbClr r="0" g="0" b="0"/>
+                        </a:fillRef>
+                        <a:effectRef idx="0">
+                          <a:scrgbClr r="0" g="0" b="0"/>
+                        </a:effectRef>
+                        <a:fontRef idx="minor">
+                          <a:schemeClr val="tx1"/>
+                        </a:fontRef>
+                      </wps:style>
+                      <wps:bodyPr/>
+                    </wps:wsp>
+                  </a:graphicData>
+                </a:graphic>
+                <wp14:sizeRelH relativeFrom="margin">
+                  <wp14:pctWidth>0</wp14:pctWidth>
+                </wp14:sizeRelH>
+                <wp14:sizeRelV relativeFrom="margin">
+                  <wp14:pctHeight>0</wp14:pctHeight>
+                </wp14:sizeRelV>
+              </wp:anchor>
+            </w:drawing>
+          </mc:Choice>
+          <mc:Fallback>
+            <w:pict>
+              <v:line w14:anchorId="055065E1" id="Conector recto 62" o:spid="_x0000_s1026" style="position:absolute;z-index:251804672;visibility:visible;mso-wrap-style:square;mso-width-percent:0;mso-height-percent:0;mso-wrap-distance-left:9pt;mso-wrap-distance-top:0;mso-wrap-distance-right:9pt;mso-wrap-distance-bottom:0;mso-position-horizontal:absolute;mso-position-horizontal-relative:text;mso-position-vertical:absolute;mso-position-vertical-relative:text;mso-width-percent:0;mso-height-percent:0;mso-width-relative:margin;mso-height-relative:margin" from="309.15pt,111.45pt" to="310.15pt,234.45pt" o:gfxdata="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" strokecolor="#e00" strokeweight="1.5pt">
+                <v:stroke dashstyle="dash"/>
+              </v:line>
+            </w:pict>
+          </mc:Fallback>
+        </mc:AlternateContent>
+      </w:r>
+      <w:r>
+        <w:rPr>
+          <w:rFonts w:ascii="Segoe UI Emoji" w:hAnsi="Segoe UI Emoji" w:cs="Segoe UI Emoji"/>
         </w:rPr>
         <w:t xml:space="preserve"> </w:t>
       </w:r>
@@ -6435,6 +6254,218 @@
       <w:r>
         <w:rPr>
           <w:rFonts w:ascii="Segoe UI Emoji" w:hAnsi="Segoe UI Emoji" w:cs="Segoe UI Emoji"/>
+          <w:noProof/>
+        </w:rPr>
+        <mc:AlternateContent>
+          <mc:Choice Requires="wps">
+            <w:drawing>
+              <wp:anchor distT="0" distB="0" distL="114300" distR="114300" simplePos="0" relativeHeight="251803648" behindDoc="0" locked="0" layoutInCell="1" allowOverlap="1" wp14:anchorId="2C31C972" wp14:editId="0288A3C2">
+                <wp:simplePos x="0" y="0"/>
+                <wp:positionH relativeFrom="column">
+                  <wp:posOffset>3998776</wp:posOffset>
+                </wp:positionH>
+                <wp:positionV relativeFrom="paragraph">
+                  <wp:posOffset>220164</wp:posOffset>
+                </wp:positionV>
+                <wp:extent cx="195580" cy="913946"/>
+                <wp:effectExtent l="0" t="0" r="13970" b="19685"/>
+                <wp:wrapNone/>
+                <wp:docPr id="1903422487" name="Rectángulo 61"/>
+                <wp:cNvGraphicFramePr/>
+                <a:graphic xmlns:a="http://schemas.openxmlformats.org/drawingml/2006/main">
+                  <a:graphicData uri="http://schemas.microsoft.com/office/word/2010/wordprocessingShape">
+                    <wps:wsp>
+                      <wps:cNvSpPr/>
+                      <wps:spPr>
+                        <a:xfrm>
+                          <a:off x="0" y="0"/>
+                          <a:ext cx="195580" cy="913946"/>
+                        </a:xfrm>
+                        <a:prstGeom prst="rect">
+                          <a:avLst/>
+                        </a:prstGeom>
+                      </wps:spPr>
+                      <wps:style>
+                        <a:lnRef idx="2">
+                          <a:schemeClr val="accent1">
+                            <a:shade val="15000"/>
+                          </a:schemeClr>
+                        </a:lnRef>
+                        <a:fillRef idx="1">
+                          <a:schemeClr val="accent1"/>
+                        </a:fillRef>
+                        <a:effectRef idx="0">
+                          <a:schemeClr val="accent1"/>
+                        </a:effectRef>
+                        <a:fontRef idx="minor">
+                          <a:schemeClr val="lt1"/>
+                        </a:fontRef>
+                      </wps:style>
+                      <wps:bodyPr rot="0" spcFirstLastPara="0" vertOverflow="overflow" horzOverflow="overflow" vert="horz" wrap="square" lIns="91440" tIns="45720" rIns="91440" bIns="45720" numCol="1" spcCol="0" rtlCol="0" fromWordArt="0" anchor="ctr" anchorCtr="0" forceAA="0" compatLnSpc="1">
+                        <a:prstTxWarp prst="textNoShape">
+                          <a:avLst/>
+                        </a:prstTxWarp>
+                        <a:noAutofit/>
+                      </wps:bodyPr>
+                    </wps:wsp>
+                  </a:graphicData>
+                </a:graphic>
+                <wp14:sizeRelV relativeFrom="margin">
+                  <wp14:pctHeight>0</wp14:pctHeight>
+                </wp14:sizeRelV>
+              </wp:anchor>
+            </w:drawing>
+          </mc:Choice>
+          <mc:Fallback>
+            <w:pict>
+              <v:rect w14:anchorId="55D38B14" id="Rectángulo 61" o:spid="_x0000_s1026" style="position:absolute;margin-left:314.85pt;margin-top:17.35pt;width:15.4pt;height:71.95pt;z-index:251803648;visibility:visible;mso-wrap-style:square;mso-height-percent:0;mso-wrap-distance-left:9pt;mso-wrap-distance-top:0;mso-wrap-distance-right:9pt;mso-wrap-distance-bottom:0;mso-position-horizontal:absolute;mso-position-horizontal-relative:text;mso-position-vertical:absolute;mso-position-vertical-relative:text;mso-height-percent:0;mso-height-relative:margin;v-text-anchor:middle" o:gfxdata="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" fillcolor="#156082 [3204]" strokecolor="#030e13 [484]" strokeweight="1pt"/>
+            </w:pict>
+          </mc:Fallback>
+        </mc:AlternateContent>
+      </w:r>
+      <w:r>
+        <w:rPr>
+          <w:rFonts w:ascii="Segoe UI Emoji" w:hAnsi="Segoe UI Emoji" w:cs="Segoe UI Emoji"/>
+          <w:noProof/>
+        </w:rPr>
+        <mc:AlternateContent>
+          <mc:Choice Requires="wps">
+            <w:drawing>
+              <wp:anchor distT="0" distB="0" distL="114300" distR="114300" simplePos="0" relativeHeight="251791360" behindDoc="0" locked="0" layoutInCell="1" allowOverlap="1" wp14:anchorId="1528A2A2" wp14:editId="0B642EDA">
+                <wp:simplePos x="0" y="0"/>
+                <wp:positionH relativeFrom="margin">
+                  <wp:align>center</wp:align>
+                </wp:positionH>
+                <wp:positionV relativeFrom="paragraph">
+                  <wp:posOffset>12065</wp:posOffset>
+                </wp:positionV>
+                <wp:extent cx="195580" cy="1120775"/>
+                <wp:effectExtent l="0" t="0" r="13970" b="22225"/>
+                <wp:wrapNone/>
+                <wp:docPr id="2088210162" name="Rectángulo 61"/>
+                <wp:cNvGraphicFramePr/>
+                <a:graphic xmlns:a="http://schemas.openxmlformats.org/drawingml/2006/main">
+                  <a:graphicData uri="http://schemas.microsoft.com/office/word/2010/wordprocessingShape">
+                    <wps:wsp>
+                      <wps:cNvSpPr/>
+                      <wps:spPr>
+                        <a:xfrm>
+                          <a:off x="0" y="0"/>
+                          <a:ext cx="195580" cy="1120775"/>
+                        </a:xfrm>
+                        <a:prstGeom prst="rect">
+                          <a:avLst/>
+                        </a:prstGeom>
+                      </wps:spPr>
+                      <wps:style>
+                        <a:lnRef idx="2">
+                          <a:schemeClr val="accent1">
+                            <a:shade val="15000"/>
+                          </a:schemeClr>
+                        </a:lnRef>
+                        <a:fillRef idx="1">
+                          <a:schemeClr val="accent1"/>
+                        </a:fillRef>
+                        <a:effectRef idx="0">
+                          <a:schemeClr val="accent1"/>
+                        </a:effectRef>
+                        <a:fontRef idx="minor">
+                          <a:schemeClr val="lt1"/>
+                        </a:fontRef>
+                      </wps:style>
+                      <wps:bodyPr rot="0" spcFirstLastPara="0" vertOverflow="overflow" horzOverflow="overflow" vert="horz" wrap="square" lIns="91440" tIns="45720" rIns="91440" bIns="45720" numCol="1" spcCol="0" rtlCol="0" fromWordArt="0" anchor="ctr" anchorCtr="0" forceAA="0" compatLnSpc="1">
+                        <a:prstTxWarp prst="textNoShape">
+                          <a:avLst/>
+                        </a:prstTxWarp>
+                        <a:noAutofit/>
+                      </wps:bodyPr>
+                    </wps:wsp>
+                  </a:graphicData>
+                </a:graphic>
+              </wp:anchor>
+            </w:drawing>
+          </mc:Choice>
+          <mc:Fallback>
+            <w:pict>
+              <v:rect w14:anchorId="459D30D9" id="Rectángulo 61" o:spid="_x0000_s1026" style="position:absolute;margin-left:0;margin-top:.95pt;width:15.4pt;height:88.25pt;z-index:251791360;visibility:visible;mso-wrap-style:square;mso-wrap-distance-left:9pt;mso-wrap-distance-top:0;mso-wrap-distance-right:9pt;mso-wrap-distance-bottom:0;mso-position-horizontal:center;mso-position-horizontal-relative:margin;mso-position-vertical:absolute;mso-position-vertical-relative:text;v-text-anchor:middle" o:gfxdata="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" fillcolor="#156082 [3204]" strokecolor="#030e13 [484]" strokeweight="1pt">
+                <w10:wrap anchorx="margin"/>
+              </v:rect>
+            </w:pict>
+          </mc:Fallback>
+        </mc:AlternateContent>
+      </w:r>
+      <w:r>
+        <w:rPr>
+          <w:rFonts w:ascii="Segoe UI Emoji" w:hAnsi="Segoe UI Emoji" w:cs="Segoe UI Emoji"/>
+          <w:noProof/>
+        </w:rPr>
+        <mc:AlternateContent>
+          <mc:Choice Requires="wps">
+            <w:drawing>
+              <wp:anchor distT="0" distB="0" distL="114300" distR="114300" simplePos="0" relativeHeight="251799552" behindDoc="0" locked="0" layoutInCell="1" allowOverlap="1" wp14:anchorId="1F652C98" wp14:editId="59BFCAF7">
+                <wp:simplePos x="0" y="0"/>
+                <wp:positionH relativeFrom="column">
+                  <wp:posOffset>3302000</wp:posOffset>
+                </wp:positionH>
+                <wp:positionV relativeFrom="paragraph">
+                  <wp:posOffset>12700</wp:posOffset>
+                </wp:positionV>
+                <wp:extent cx="195580" cy="1120775"/>
+                <wp:effectExtent l="0" t="0" r="13970" b="22225"/>
+                <wp:wrapNone/>
+                <wp:docPr id="506454414" name="Rectángulo 61"/>
+                <wp:cNvGraphicFramePr/>
+                <a:graphic xmlns:a="http://schemas.openxmlformats.org/drawingml/2006/main">
+                  <a:graphicData uri="http://schemas.microsoft.com/office/word/2010/wordprocessingShape">
+                    <wps:wsp>
+                      <wps:cNvSpPr/>
+                      <wps:spPr>
+                        <a:xfrm>
+                          <a:off x="0" y="0"/>
+                          <a:ext cx="195580" cy="1120775"/>
+                        </a:xfrm>
+                        <a:prstGeom prst="rect">
+                          <a:avLst/>
+                        </a:prstGeom>
+                      </wps:spPr>
+                      <wps:style>
+                        <a:lnRef idx="2">
+                          <a:schemeClr val="accent1">
+                            <a:shade val="15000"/>
+                          </a:schemeClr>
+                        </a:lnRef>
+                        <a:fillRef idx="1">
+                          <a:schemeClr val="accent1"/>
+                        </a:fillRef>
+                        <a:effectRef idx="0">
+                          <a:schemeClr val="accent1"/>
+                        </a:effectRef>
+                        <a:fontRef idx="minor">
+                          <a:schemeClr val="lt1"/>
+                        </a:fontRef>
+                      </wps:style>
+                      <wps:bodyPr rot="0" spcFirstLastPara="0" vertOverflow="overflow" horzOverflow="overflow" vert="horz" wrap="square" lIns="91440" tIns="45720" rIns="91440" bIns="45720" numCol="1" spcCol="0" rtlCol="0" fromWordArt="0" anchor="ctr" anchorCtr="0" forceAA="0" compatLnSpc="1">
+                        <a:prstTxWarp prst="textNoShape">
+                          <a:avLst/>
+                        </a:prstTxWarp>
+                        <a:noAutofit/>
+                      </wps:bodyPr>
+                    </wps:wsp>
+                  </a:graphicData>
+                </a:graphic>
+              </wp:anchor>
+            </w:drawing>
+          </mc:Choice>
+          <mc:Fallback>
+            <w:pict>
+              <v:rect w14:anchorId="711EA79A" id="Rectángulo 61" o:spid="_x0000_s1026" style="position:absolute;margin-left:260pt;margin-top:1pt;width:15.4pt;height:88.25pt;z-index:251799552;visibility:visible;mso-wrap-style:square;mso-wrap-distance-left:9pt;mso-wrap-distance-top:0;mso-wrap-distance-right:9pt;mso-wrap-distance-bottom:0;mso-position-horizontal:absolute;mso-position-horizontal-relative:text;mso-position-vertical:absolute;mso-position-vertical-relative:text;v-text-anchor:middle" o:gfxdata="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" fillcolor="#156082 [3204]" strokecolor="#030e13 [484]" strokeweight="1pt"/>
+            </w:pict>
+          </mc:Fallback>
+        </mc:AlternateContent>
+      </w:r>
+      <w:r>
+        <w:rPr>
+          <w:rFonts w:ascii="Segoe UI Emoji" w:hAnsi="Segoe UI Emoji" w:cs="Segoe UI Emoji"/>
         </w:rPr>
         <w:t xml:space="preserve">  </w:t>
       </w:r>
@@ -6449,6 +6480,222 @@
       </w:pPr>
       <w:r>
         <w:rPr>
+          <w:rFonts w:ascii="Segoe UI Emoji" w:hAnsi="Segoe UI Emoji" w:cs="Segoe UI Emoji"/>
+          <w:noProof/>
+        </w:rPr>
+        <mc:AlternateContent>
+          <mc:Choice Requires="wps">
+            <w:drawing>
+              <wp:anchor distT="0" distB="0" distL="114300" distR="114300" simplePos="0" relativeHeight="251801600" behindDoc="0" locked="0" layoutInCell="1" allowOverlap="1" wp14:anchorId="1CD14E2C" wp14:editId="7E499E07">
+                <wp:simplePos x="0" y="0"/>
+                <wp:positionH relativeFrom="column">
+                  <wp:posOffset>3650434</wp:posOffset>
+                </wp:positionH>
+                <wp:positionV relativeFrom="paragraph">
+                  <wp:posOffset>175441</wp:posOffset>
+                </wp:positionV>
+                <wp:extent cx="195580" cy="641623"/>
+                <wp:effectExtent l="0" t="0" r="13970" b="25400"/>
+                <wp:wrapNone/>
+                <wp:docPr id="71936373" name="Rectángulo 61"/>
+                <wp:cNvGraphicFramePr/>
+                <a:graphic xmlns:a="http://schemas.openxmlformats.org/drawingml/2006/main">
+                  <a:graphicData uri="http://schemas.microsoft.com/office/word/2010/wordprocessingShape">
+                    <wps:wsp>
+                      <wps:cNvSpPr/>
+                      <wps:spPr>
+                        <a:xfrm>
+                          <a:off x="0" y="0"/>
+                          <a:ext cx="195580" cy="641623"/>
+                        </a:xfrm>
+                        <a:prstGeom prst="rect">
+                          <a:avLst/>
+                        </a:prstGeom>
+                      </wps:spPr>
+                      <wps:style>
+                        <a:lnRef idx="2">
+                          <a:schemeClr val="accent1">
+                            <a:shade val="15000"/>
+                          </a:schemeClr>
+                        </a:lnRef>
+                        <a:fillRef idx="1">
+                          <a:schemeClr val="accent1"/>
+                        </a:fillRef>
+                        <a:effectRef idx="0">
+                          <a:schemeClr val="accent1"/>
+                        </a:effectRef>
+                        <a:fontRef idx="minor">
+                          <a:schemeClr val="lt1"/>
+                        </a:fontRef>
+                      </wps:style>
+                      <wps:bodyPr rot="0" spcFirstLastPara="0" vertOverflow="overflow" horzOverflow="overflow" vert="horz" wrap="square" lIns="91440" tIns="45720" rIns="91440" bIns="45720" numCol="1" spcCol="0" rtlCol="0" fromWordArt="0" anchor="ctr" anchorCtr="0" forceAA="0" compatLnSpc="1">
+                        <a:prstTxWarp prst="textNoShape">
+                          <a:avLst/>
+                        </a:prstTxWarp>
+                        <a:noAutofit/>
+                      </wps:bodyPr>
+                    </wps:wsp>
+                  </a:graphicData>
+                </a:graphic>
+                <wp14:sizeRelV relativeFrom="margin">
+                  <wp14:pctHeight>0</wp14:pctHeight>
+                </wp14:sizeRelV>
+              </wp:anchor>
+            </w:drawing>
+          </mc:Choice>
+          <mc:Fallback>
+            <w:pict>
+              <v:rect w14:anchorId="0D308B55" id="Rectángulo 61" o:spid="_x0000_s1026" style="position:absolute;margin-left:287.45pt;margin-top:13.8pt;width:15.4pt;height:50.5pt;z-index:251801600;visibility:visible;mso-wrap-style:square;mso-height-percent:0;mso-wrap-distance-left:9pt;mso-wrap-distance-top:0;mso-wrap-distance-right:9pt;mso-wrap-distance-bottom:0;mso-position-horizontal:absolute;mso-position-horizontal-relative:text;mso-position-vertical:absolute;mso-position-vertical-relative:text;mso-height-percent:0;mso-height-relative:margin;v-text-anchor:middle" o:gfxdata="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" fillcolor="#156082 [3204]" strokecolor="#030e13 [484]" strokeweight="1pt"/>
+            </w:pict>
+          </mc:Fallback>
+        </mc:AlternateContent>
+      </w:r>
+      <w:r>
+        <w:rPr>
+          <w:rFonts w:ascii="Segoe UI Emoji" w:hAnsi="Segoe UI Emoji" w:cs="Segoe UI Emoji"/>
+          <w:noProof/>
+        </w:rPr>
+        <mc:AlternateContent>
+          <mc:Choice Requires="wps">
+            <w:drawing>
+              <wp:anchor distT="0" distB="0" distL="114300" distR="114300" simplePos="0" relativeHeight="251789312" behindDoc="0" locked="0" layoutInCell="1" allowOverlap="1" wp14:anchorId="7C282EBA" wp14:editId="3C8617D5">
+                <wp:simplePos x="0" y="0"/>
+                <wp:positionH relativeFrom="column">
+                  <wp:posOffset>4662805</wp:posOffset>
+                </wp:positionH>
+                <wp:positionV relativeFrom="paragraph">
+                  <wp:posOffset>278855</wp:posOffset>
+                </wp:positionV>
+                <wp:extent cx="195580" cy="538117"/>
+                <wp:effectExtent l="0" t="0" r="13970" b="14605"/>
+                <wp:wrapNone/>
+                <wp:docPr id="1731955485" name="Rectángulo 61"/>
+                <wp:cNvGraphicFramePr/>
+                <a:graphic xmlns:a="http://schemas.openxmlformats.org/drawingml/2006/main">
+                  <a:graphicData uri="http://schemas.microsoft.com/office/word/2010/wordprocessingShape">
+                    <wps:wsp>
+                      <wps:cNvSpPr/>
+                      <wps:spPr>
+                        <a:xfrm>
+                          <a:off x="0" y="0"/>
+                          <a:ext cx="195580" cy="538117"/>
+                        </a:xfrm>
+                        <a:prstGeom prst="rect">
+                          <a:avLst/>
+                        </a:prstGeom>
+                      </wps:spPr>
+                      <wps:style>
+                        <a:lnRef idx="2">
+                          <a:schemeClr val="accent1">
+                            <a:shade val="15000"/>
+                          </a:schemeClr>
+                        </a:lnRef>
+                        <a:fillRef idx="1">
+                          <a:schemeClr val="accent1"/>
+                        </a:fillRef>
+                        <a:effectRef idx="0">
+                          <a:schemeClr val="accent1"/>
+                        </a:effectRef>
+                        <a:fontRef idx="minor">
+                          <a:schemeClr val="lt1"/>
+                        </a:fontRef>
+                      </wps:style>
+                      <wps:bodyPr rot="0" spcFirstLastPara="0" vertOverflow="overflow" horzOverflow="overflow" vert="horz" wrap="square" lIns="91440" tIns="45720" rIns="91440" bIns="45720" numCol="1" spcCol="0" rtlCol="0" fromWordArt="0" anchor="ctr" anchorCtr="0" forceAA="0" compatLnSpc="1">
+                        <a:prstTxWarp prst="textNoShape">
+                          <a:avLst/>
+                        </a:prstTxWarp>
+                        <a:noAutofit/>
+                      </wps:bodyPr>
+                    </wps:wsp>
+                  </a:graphicData>
+                </a:graphic>
+                <wp14:sizeRelV relativeFrom="margin">
+                  <wp14:pctHeight>0</wp14:pctHeight>
+                </wp14:sizeRelV>
+              </wp:anchor>
+            </w:drawing>
+          </mc:Choice>
+          <mc:Fallback>
+            <w:pict>
+              <v:rect w14:anchorId="3988CDB8" id="Rectángulo 61" o:spid="_x0000_s1026" style="position:absolute;margin-left:367.15pt;margin-top:21.95pt;width:15.4pt;height:42.35pt;z-index:251789312;visibility:visible;mso-wrap-style:square;mso-height-percent:0;mso-wrap-distance-left:9pt;mso-wrap-distance-top:0;mso-wrap-distance-right:9pt;mso-wrap-distance-bottom:0;mso-position-horizontal:absolute;mso-position-horizontal-relative:text;mso-position-vertical:absolute;mso-position-vertical-relative:text;mso-height-percent:0;mso-height-relative:margin;v-text-anchor:middle" o:gfxdata="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" fillcolor="#156082 [3204]" strokecolor="#030e13 [484]" strokeweight="1pt"/>
+            </w:pict>
+          </mc:Fallback>
+        </mc:AlternateContent>
+      </w:r>
+      <w:r>
+        <w:rPr>
+          <w:rFonts w:ascii="Segoe UI Emoji" w:hAnsi="Segoe UI Emoji" w:cs="Segoe UI Emoji"/>
+          <w:noProof/>
+        </w:rPr>
+        <mc:AlternateContent>
+          <mc:Choice Requires="wps">
+            <w:drawing>
+              <wp:anchor distT="0" distB="0" distL="114300" distR="114300" simplePos="0" relativeHeight="251787264" behindDoc="0" locked="0" layoutInCell="1" allowOverlap="1" wp14:anchorId="6635AFD2" wp14:editId="2848B356">
+                <wp:simplePos x="0" y="0"/>
+                <wp:positionH relativeFrom="column">
+                  <wp:posOffset>4956719</wp:posOffset>
+                </wp:positionH>
+                <wp:positionV relativeFrom="paragraph">
+                  <wp:posOffset>153670</wp:posOffset>
+                </wp:positionV>
+                <wp:extent cx="195580" cy="663575"/>
+                <wp:effectExtent l="0" t="0" r="13970" b="22225"/>
+                <wp:wrapNone/>
+                <wp:docPr id="397667291" name="Rectángulo 61"/>
+                <wp:cNvGraphicFramePr/>
+                <a:graphic xmlns:a="http://schemas.openxmlformats.org/drawingml/2006/main">
+                  <a:graphicData uri="http://schemas.microsoft.com/office/word/2010/wordprocessingShape">
+                    <wps:wsp>
+                      <wps:cNvSpPr/>
+                      <wps:spPr>
+                        <a:xfrm>
+                          <a:off x="0" y="0"/>
+                          <a:ext cx="195580" cy="663575"/>
+                        </a:xfrm>
+                        <a:prstGeom prst="rect">
+                          <a:avLst/>
+                        </a:prstGeom>
+                      </wps:spPr>
+                      <wps:style>
+                        <a:lnRef idx="2">
+                          <a:schemeClr val="accent1">
+                            <a:shade val="15000"/>
+                          </a:schemeClr>
+                        </a:lnRef>
+                        <a:fillRef idx="1">
+                          <a:schemeClr val="accent1"/>
+                        </a:fillRef>
+                        <a:effectRef idx="0">
+                          <a:schemeClr val="accent1"/>
+                        </a:effectRef>
+                        <a:fontRef idx="minor">
+                          <a:schemeClr val="lt1"/>
+                        </a:fontRef>
+                      </wps:style>
+                      <wps:bodyPr rot="0" spcFirstLastPara="0" vertOverflow="overflow" horzOverflow="overflow" vert="horz" wrap="square" lIns="91440" tIns="45720" rIns="91440" bIns="45720" numCol="1" spcCol="0" rtlCol="0" fromWordArt="0" anchor="ctr" anchorCtr="0" forceAA="0" compatLnSpc="1">
+                        <a:prstTxWarp prst="textNoShape">
+                          <a:avLst/>
+                        </a:prstTxWarp>
+                        <a:noAutofit/>
+                      </wps:bodyPr>
+                    </wps:wsp>
+                  </a:graphicData>
+                </a:graphic>
+                <wp14:sizeRelV relativeFrom="margin">
+                  <wp14:pctHeight>0</wp14:pctHeight>
+                </wp14:sizeRelV>
+              </wp:anchor>
+            </w:drawing>
+          </mc:Choice>
+          <mc:Fallback>
+            <w:pict>
+              <v:rect w14:anchorId="6594B918" id="Rectángulo 61" o:spid="_x0000_s1026" style="position:absolute;margin-left:390.3pt;margin-top:12.1pt;width:15.4pt;height:52.25pt;z-index:251787264;visibility:visible;mso-wrap-style:square;mso-height-percent:0;mso-wrap-distance-left:9pt;mso-wrap-distance-top:0;mso-wrap-distance-right:9pt;mso-wrap-distance-bottom:0;mso-position-horizontal:absolute;mso-position-horizontal-relative:text;mso-position-vertical:absolute;mso-position-vertical-relative:text;mso-height-percent:0;mso-height-relative:margin;v-text-anchor:middle" o:gfxdata="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" fillcolor="#156082 [3204]" strokecolor="#030e13 [484]" strokeweight="1pt"/>
+            </w:pict>
+          </mc:Fallback>
+        </mc:AlternateContent>
+      </w:r>
+      <w:r>
+        <w:rPr>
           <w:rFonts w:cs="Segoe UI Emoji"/>
           <w:sz w:val="28"/>
           <w:szCs w:val="28"/>
@@ -6457,6 +6704,231 @@
       </w:r>
     </w:p>
     <w:p>
+      <w:pPr>
+        <w:rPr>
+          <w:rFonts w:cs="Segoe UI Emoji"/>
+          <w:sz w:val="28"/>
+          <w:szCs w:val="28"/>
+        </w:rPr>
+      </w:pPr>
+      <w:r>
+        <w:rPr>
+          <w:rFonts w:ascii="Segoe UI Emoji" w:hAnsi="Segoe UI Emoji" w:cs="Segoe UI Emoji"/>
+          <w:noProof/>
+        </w:rPr>
+        <mc:AlternateContent>
+          <mc:Choice Requires="wps">
+            <w:drawing>
+              <wp:anchor distT="0" distB="0" distL="114300" distR="114300" simplePos="0" relativeHeight="251785216" behindDoc="0" locked="0" layoutInCell="1" allowOverlap="1" wp14:anchorId="27F06D2B" wp14:editId="1884BF5C">
+                <wp:simplePos x="0" y="0"/>
+                <wp:positionH relativeFrom="column">
+                  <wp:posOffset>2616291</wp:posOffset>
+                </wp:positionH>
+                <wp:positionV relativeFrom="paragraph">
+                  <wp:posOffset>165281</wp:posOffset>
+                </wp:positionV>
+                <wp:extent cx="195580" cy="298904"/>
+                <wp:effectExtent l="0" t="0" r="13970" b="25400"/>
+                <wp:wrapNone/>
+                <wp:docPr id="2063552775" name="Rectángulo 61"/>
+                <wp:cNvGraphicFramePr/>
+                <a:graphic xmlns:a="http://schemas.openxmlformats.org/drawingml/2006/main">
+                  <a:graphicData uri="http://schemas.microsoft.com/office/word/2010/wordprocessingShape">
+                    <wps:wsp>
+                      <wps:cNvSpPr/>
+                      <wps:spPr>
+                        <a:xfrm>
+                          <a:off x="0" y="0"/>
+                          <a:ext cx="195580" cy="298904"/>
+                        </a:xfrm>
+                        <a:prstGeom prst="rect">
+                          <a:avLst/>
+                        </a:prstGeom>
+                      </wps:spPr>
+                      <wps:style>
+                        <a:lnRef idx="2">
+                          <a:schemeClr val="accent1">
+                            <a:shade val="15000"/>
+                          </a:schemeClr>
+                        </a:lnRef>
+                        <a:fillRef idx="1">
+                          <a:schemeClr val="accent1"/>
+                        </a:fillRef>
+                        <a:effectRef idx="0">
+                          <a:schemeClr val="accent1"/>
+                        </a:effectRef>
+                        <a:fontRef idx="minor">
+                          <a:schemeClr val="lt1"/>
+                        </a:fontRef>
+                      </wps:style>
+                      <wps:bodyPr rot="0" spcFirstLastPara="0" vertOverflow="overflow" horzOverflow="overflow" vert="horz" wrap="square" lIns="91440" tIns="45720" rIns="91440" bIns="45720" numCol="1" spcCol="0" rtlCol="0" fromWordArt="0" anchor="ctr" anchorCtr="0" forceAA="0" compatLnSpc="1">
+                        <a:prstTxWarp prst="textNoShape">
+                          <a:avLst/>
+                        </a:prstTxWarp>
+                        <a:noAutofit/>
+                      </wps:bodyPr>
+                    </wps:wsp>
+                  </a:graphicData>
+                </a:graphic>
+                <wp14:sizeRelV relativeFrom="margin">
+                  <wp14:pctHeight>0</wp14:pctHeight>
+                </wp14:sizeRelV>
+              </wp:anchor>
+            </w:drawing>
+          </mc:Choice>
+          <mc:Fallback>
+            <w:pict>
+              <v:rect w14:anchorId="551D0DE4" id="Rectángulo 61" o:spid="_x0000_s1026" style="position:absolute;margin-left:206pt;margin-top:13pt;width:15.4pt;height:23.55pt;z-index:251785216;visibility:visible;mso-wrap-style:square;mso-height-percent:0;mso-wrap-distance-left:9pt;mso-wrap-distance-top:0;mso-wrap-distance-right:9pt;mso-wrap-distance-bottom:0;mso-position-horizontal:absolute;mso-position-horizontal-relative:text;mso-position-vertical:absolute;mso-position-vertical-relative:text;mso-height-percent:0;mso-height-relative:margin;v-text-anchor:middle" o:gfxdata="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" fillcolor="#156082 [3204]" strokecolor="#030e13 [484]" strokeweight="1pt"/>
+            </w:pict>
+          </mc:Fallback>
+        </mc:AlternateContent>
+      </w:r>
+      <w:r>
+        <w:rPr>
+          <w:rFonts w:ascii="Segoe UI Emoji" w:hAnsi="Segoe UI Emoji" w:cs="Segoe UI Emoji"/>
+          <w:noProof/>
+        </w:rPr>
+        <mc:AlternateContent>
+          <mc:Choice Requires="wps">
+            <w:drawing>
+              <wp:anchor distT="0" distB="0" distL="114300" distR="114300" simplePos="0" relativeHeight="251793408" behindDoc="0" locked="0" layoutInCell="1" allowOverlap="1" wp14:anchorId="261E1907" wp14:editId="004E6EBF">
+                <wp:simplePos x="0" y="0"/>
+                <wp:positionH relativeFrom="column">
+                  <wp:posOffset>2953748</wp:posOffset>
+                </wp:positionH>
+                <wp:positionV relativeFrom="paragraph">
+                  <wp:posOffset>7439</wp:posOffset>
+                </wp:positionV>
+                <wp:extent cx="195580" cy="456746"/>
+                <wp:effectExtent l="0" t="0" r="13970" b="19685"/>
+                <wp:wrapNone/>
+                <wp:docPr id="937722373" name="Rectángulo 61"/>
+                <wp:cNvGraphicFramePr/>
+                <a:graphic xmlns:a="http://schemas.openxmlformats.org/drawingml/2006/main">
+                  <a:graphicData uri="http://schemas.microsoft.com/office/word/2010/wordprocessingShape">
+                    <wps:wsp>
+                      <wps:cNvSpPr/>
+                      <wps:spPr>
+                        <a:xfrm>
+                          <a:off x="0" y="0"/>
+                          <a:ext cx="195580" cy="456746"/>
+                        </a:xfrm>
+                        <a:prstGeom prst="rect">
+                          <a:avLst/>
+                        </a:prstGeom>
+                      </wps:spPr>
+                      <wps:style>
+                        <a:lnRef idx="2">
+                          <a:schemeClr val="accent1">
+                            <a:shade val="15000"/>
+                          </a:schemeClr>
+                        </a:lnRef>
+                        <a:fillRef idx="1">
+                          <a:schemeClr val="accent1"/>
+                        </a:fillRef>
+                        <a:effectRef idx="0">
+                          <a:schemeClr val="accent1"/>
+                        </a:effectRef>
+                        <a:fontRef idx="minor">
+                          <a:schemeClr val="lt1"/>
+                        </a:fontRef>
+                      </wps:style>
+                      <wps:bodyPr rot="0" spcFirstLastPara="0" vertOverflow="overflow" horzOverflow="overflow" vert="horz" wrap="square" lIns="91440" tIns="45720" rIns="91440" bIns="45720" numCol="1" spcCol="0" rtlCol="0" fromWordArt="0" anchor="ctr" anchorCtr="0" forceAA="0" compatLnSpc="1">
+                        <a:prstTxWarp prst="textNoShape">
+                          <a:avLst/>
+                        </a:prstTxWarp>
+                        <a:noAutofit/>
+                      </wps:bodyPr>
+                    </wps:wsp>
+                  </a:graphicData>
+                </a:graphic>
+                <wp14:sizeRelV relativeFrom="margin">
+                  <wp14:pctHeight>0</wp14:pctHeight>
+                </wp14:sizeRelV>
+              </wp:anchor>
+            </w:drawing>
+          </mc:Choice>
+          <mc:Fallback>
+            <w:pict>
+              <v:rect w14:anchorId="04426ED6" id="Rectángulo 61" o:spid="_x0000_s1026" style="position:absolute;margin-left:232.6pt;margin-top:.6pt;width:15.4pt;height:35.95pt;z-index:251793408;visibility:visible;mso-wrap-style:square;mso-height-percent:0;mso-wrap-distance-left:9pt;mso-wrap-distance-top:0;mso-wrap-distance-right:9pt;mso-wrap-distance-bottom:0;mso-position-horizontal:absolute;mso-position-horizontal-relative:text;mso-position-vertical:absolute;mso-position-vertical-relative:text;mso-height-percent:0;mso-height-relative:margin;v-text-anchor:middle" o:gfxdata="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" fillcolor="#156082 [3204]" strokecolor="#030e13 [484]" strokeweight="1pt"/>
+            </w:pict>
+          </mc:Fallback>
+        </mc:AlternateContent>
+      </w:r>
+      <w:r>
+        <w:rPr>
+          <w:rFonts w:ascii="Segoe UI Emoji" w:hAnsi="Segoe UI Emoji" w:cs="Segoe UI Emoji"/>
+          <w:noProof/>
+        </w:rPr>
+        <mc:AlternateContent>
+          <mc:Choice Requires="wps">
+            <w:drawing>
+              <wp:anchor distT="0" distB="0" distL="114300" distR="114300" simplePos="0" relativeHeight="251783168" behindDoc="0" locked="0" layoutInCell="1" allowOverlap="1" wp14:anchorId="5631746A" wp14:editId="58310535">
+                <wp:simplePos x="0" y="0"/>
+                <wp:positionH relativeFrom="column">
+                  <wp:posOffset>5326834</wp:posOffset>
+                </wp:positionH>
+                <wp:positionV relativeFrom="paragraph">
+                  <wp:posOffset>197939</wp:posOffset>
+                </wp:positionV>
+                <wp:extent cx="195580" cy="266246"/>
+                <wp:effectExtent l="0" t="0" r="13970" b="19685"/>
+                <wp:wrapNone/>
+                <wp:docPr id="31944829" name="Rectángulo 61"/>
+                <wp:cNvGraphicFramePr/>
+                <a:graphic xmlns:a="http://schemas.openxmlformats.org/drawingml/2006/main">
+                  <a:graphicData uri="http://schemas.microsoft.com/office/word/2010/wordprocessingShape">
+                    <wps:wsp>
+                      <wps:cNvSpPr/>
+                      <wps:spPr>
+                        <a:xfrm>
+                          <a:off x="0" y="0"/>
+                          <a:ext cx="195580" cy="266246"/>
+                        </a:xfrm>
+                        <a:prstGeom prst="rect">
+                          <a:avLst/>
+                        </a:prstGeom>
+                      </wps:spPr>
+                      <wps:style>
+                        <a:lnRef idx="2">
+                          <a:schemeClr val="accent1">
+                            <a:shade val="15000"/>
+                          </a:schemeClr>
+                        </a:lnRef>
+                        <a:fillRef idx="1">
+                          <a:schemeClr val="accent1"/>
+                        </a:fillRef>
+                        <a:effectRef idx="0">
+                          <a:schemeClr val="accent1"/>
+                        </a:effectRef>
+                        <a:fontRef idx="minor">
+                          <a:schemeClr val="lt1"/>
+                        </a:fontRef>
+                      </wps:style>
+                      <wps:bodyPr rot="0" spcFirstLastPara="0" vertOverflow="overflow" horzOverflow="overflow" vert="horz" wrap="square" lIns="91440" tIns="45720" rIns="91440" bIns="45720" numCol="1" spcCol="0" rtlCol="0" fromWordArt="0" anchor="ctr" anchorCtr="0" forceAA="0" compatLnSpc="1">
+                        <a:prstTxWarp prst="textNoShape">
+                          <a:avLst/>
+                        </a:prstTxWarp>
+                        <a:noAutofit/>
+                      </wps:bodyPr>
+                    </wps:wsp>
+                  </a:graphicData>
+                </a:graphic>
+                <wp14:sizeRelV relativeFrom="margin">
+                  <wp14:pctHeight>0</wp14:pctHeight>
+                </wp14:sizeRelV>
+              </wp:anchor>
+            </w:drawing>
+          </mc:Choice>
+          <mc:Fallback>
+            <w:pict>
+              <v:rect w14:anchorId="43FC8EDD" id="Rectángulo 61" o:spid="_x0000_s1026" style="position:absolute;margin-left:419.45pt;margin-top:15.6pt;width:15.4pt;height:20.95pt;z-index:251783168;visibility:visible;mso-wrap-style:square;mso-height-percent:0;mso-wrap-distance-left:9pt;mso-wrap-distance-top:0;mso-wrap-distance-right:9pt;mso-wrap-distance-bottom:0;mso-position-horizontal:absolute;mso-position-horizontal-relative:text;mso-position-vertical:absolute;mso-position-vertical-relative:text;mso-height-percent:0;mso-height-relative:margin;v-text-anchor:middle" o:gfxdata="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" fillcolor="#156082 [3204]" strokecolor="#030e13 [484]" strokeweight="1pt"/>
+            </w:pict>
+          </mc:Fallback>
+        </mc:AlternateContent>
+      </w:r>
+    </w:p>
+    <w:p>
       <w:bookmarkStart w:id="0" w:name="_Hlk196764961"/>
       <w:r>
         <w:rPr>
@@ -6494,13 +6966,13 @@
         <mc:AlternateContent>
           <mc:Choice Requires="wps">
             <w:drawing>
-              <wp:anchor distT="45720" distB="45720" distL="114300" distR="114300" simplePos="0" relativeHeight="251745280" behindDoc="0" locked="0" layoutInCell="1" allowOverlap="1" wp14:anchorId="63745344" wp14:editId="1D17736E">
+              <wp:anchor distT="45720" distB="45720" distL="114300" distR="114300" simplePos="0" relativeHeight="251745280" behindDoc="0" locked="0" layoutInCell="1" allowOverlap="1" wp14:anchorId="63745344" wp14:editId="366E370D">
                 <wp:simplePos x="0" y="0"/>
                 <wp:positionH relativeFrom="margin">
                   <wp:align>right</wp:align>
                 </wp:positionH>
                 <wp:positionV relativeFrom="paragraph">
-                  <wp:posOffset>3144520</wp:posOffset>
+                  <wp:posOffset>2763520</wp:posOffset>
                 </wp:positionV>
                 <wp:extent cx="1362075" cy="276225"/>
                 <wp:effectExtent l="0" t="0" r="28575" b="28575"/>
@@ -6566,7 +7038,7 @@
           </mc:Choice>
           <mc:Fallback>
             <w:pict>
-              <v:shape w14:anchorId="63745344" id="_x0000_s1051" type="#_x0000_t202" style="position:absolute;margin-left:56.05pt;margin-top:247.6pt;width:107.25pt;height:21.75pt;z-index:251745280;visibility:visible;mso-wrap-style:square;mso-width-percent:0;mso-height-percent:0;mso-wrap-distance-left:9pt;mso-wrap-distance-top:3.6pt;mso-wrap-distance-right:9pt;mso-wrap-distance-bottom:3.6pt;mso-position-horizontal:right;mso-position-horizontal-relative:margin;mso-position-vertical:absolute;mso-position-vertical-relative:text;mso-width-percent:0;mso-height-percent:0;mso-width-relative:margin;mso-height-relative:margin;v-text-anchor:top" o:gfxdata="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">
+              <v:shape w14:anchorId="63745344" id="_x0000_s1050" type="#_x0000_t202" style="position:absolute;margin-left:56.05pt;margin-top:217.6pt;width:107.25pt;height:21.75pt;z-index:251745280;visibility:visible;mso-wrap-style:square;mso-width-percent:0;mso-height-percent:0;mso-wrap-distance-left:9pt;mso-wrap-distance-top:3.6pt;mso-wrap-distance-right:9pt;mso-wrap-distance-bottom:3.6pt;mso-position-horizontal:right;mso-position-horizontal-relative:margin;mso-position-vertical:absolute;mso-position-vertical-relative:text;mso-width-percent:0;mso-height-percent:0;mso-width-relative:margin;mso-height-relative:margin;v-text-anchor:top" o:gfxdata="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">
                 <v:textbox>
                   <w:txbxContent>
                     <w:p>
@@ -6595,13 +7067,13 @@
         <mc:AlternateContent>
           <mc:Choice Requires="wps">
             <w:drawing>
-              <wp:anchor distT="45720" distB="45720" distL="114300" distR="114300" simplePos="0" relativeHeight="251744256" behindDoc="0" locked="0" layoutInCell="1" allowOverlap="1" wp14:anchorId="4365D1B3" wp14:editId="212DAB5A">
+              <wp:anchor distT="45720" distB="45720" distL="114300" distR="114300" simplePos="0" relativeHeight="251744256" behindDoc="0" locked="0" layoutInCell="1" allowOverlap="1" wp14:anchorId="4365D1B3" wp14:editId="77FA30B5">
                 <wp:simplePos x="0" y="0"/>
                 <wp:positionH relativeFrom="margin">
                   <wp:align>right</wp:align>
                 </wp:positionH>
                 <wp:positionV relativeFrom="paragraph">
-                  <wp:posOffset>2722880</wp:posOffset>
+                  <wp:posOffset>2316480</wp:posOffset>
                 </wp:positionV>
                 <wp:extent cx="1362075" cy="266700"/>
                 <wp:effectExtent l="0" t="0" r="28575" b="19050"/>
@@ -6667,7 +7139,7 @@
           </mc:Choice>
           <mc:Fallback>
             <w:pict>
-              <v:shape w14:anchorId="4365D1B3" id="_x0000_s1052" type="#_x0000_t202" style="position:absolute;margin-left:56.05pt;margin-top:214.4pt;width:107.25pt;height:21pt;z-index:251744256;visibility:visible;mso-wrap-style:square;mso-width-percent:0;mso-height-percent:0;mso-wrap-distance-left:9pt;mso-wrap-distance-top:3.6pt;mso-wrap-distance-right:9pt;mso-wrap-distance-bottom:3.6pt;mso-position-horizontal:right;mso-position-horizontal-relative:margin;mso-position-vertical:absolute;mso-position-vertical-relative:text;mso-width-percent:0;mso-height-percent:0;mso-width-relative:margin;mso-height-relative:margin;v-text-anchor:top" o:gfxdata="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">
+              <v:shape w14:anchorId="4365D1B3" id="_x0000_s1051" type="#_x0000_t202" style="position:absolute;margin-left:56.05pt;margin-top:182.4pt;width:107.25pt;height:21pt;z-index:251744256;visibility:visible;mso-wrap-style:square;mso-width-percent:0;mso-height-percent:0;mso-wrap-distance-left:9pt;mso-wrap-distance-top:3.6pt;mso-wrap-distance-right:9pt;mso-wrap-distance-bottom:3.6pt;mso-position-horizontal:right;mso-position-horizontal-relative:margin;mso-position-vertical:absolute;mso-position-vertical-relative:text;mso-width-percent:0;mso-height-percent:0;mso-width-relative:margin;mso-height-relative:margin;v-text-anchor:top" o:gfxdata="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">
                 <v:textbox>
                   <w:txbxContent>
                     <w:p>
@@ -6696,13 +7168,13 @@
         <mc:AlternateContent>
           <mc:Choice Requires="wps">
             <w:drawing>
-              <wp:anchor distT="45720" distB="45720" distL="114300" distR="114300" simplePos="0" relativeHeight="251742208" behindDoc="0" locked="0" layoutInCell="1" allowOverlap="1" wp14:anchorId="1B8878AD" wp14:editId="458E6DA4">
+              <wp:anchor distT="45720" distB="45720" distL="114300" distR="114300" simplePos="0" relativeHeight="251742208" behindDoc="0" locked="0" layoutInCell="1" allowOverlap="1" wp14:anchorId="1B8878AD" wp14:editId="49CDDA6B">
                 <wp:simplePos x="0" y="0"/>
                 <wp:positionH relativeFrom="margin">
                   <wp:align>right</wp:align>
                 </wp:positionH>
                 <wp:positionV relativeFrom="paragraph">
-                  <wp:posOffset>2275205</wp:posOffset>
+                  <wp:posOffset>1843405</wp:posOffset>
                 </wp:positionV>
                 <wp:extent cx="1362075" cy="266700"/>
                 <wp:effectExtent l="0" t="0" r="28575" b="19050"/>
@@ -6768,7 +7240,7 @@
           </mc:Choice>
           <mc:Fallback>
             <w:pict>
-              <v:shape w14:anchorId="1B8878AD" id="_x0000_s1053" type="#_x0000_t202" style="position:absolute;margin-left:56.05pt;margin-top:179.15pt;width:107.25pt;height:21pt;z-index:251742208;visibility:visible;mso-wrap-style:square;mso-width-percent:0;mso-height-percent:0;mso-wrap-distance-left:9pt;mso-wrap-distance-top:3.6pt;mso-wrap-distance-right:9pt;mso-wrap-distance-bottom:3.6pt;mso-position-horizontal:right;mso-position-horizontal-relative:margin;mso-position-vertical:absolute;mso-position-vertical-relative:text;mso-width-percent:0;mso-height-percent:0;mso-width-relative:margin;mso-height-relative:margin;v-text-anchor:top" o:gfxdata="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">
+              <v:shape w14:anchorId="1B8878AD" id="_x0000_s1052" type="#_x0000_t202" style="position:absolute;margin-left:56.05pt;margin-top:145.15pt;width:107.25pt;height:21pt;z-index:251742208;visibility:visible;mso-wrap-style:square;mso-width-percent:0;mso-height-percent:0;mso-wrap-distance-left:9pt;mso-wrap-distance-top:3.6pt;mso-wrap-distance-right:9pt;mso-wrap-distance-bottom:3.6pt;mso-position-horizontal:right;mso-position-horizontal-relative:margin;mso-position-vertical:absolute;mso-position-vertical-relative:text;mso-width-percent:0;mso-height-percent:0;mso-width-relative:margin;mso-height-relative:margin;v-text-anchor:top" o:gfxdata="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">
                 <v:textbox>
                   <w:txbxContent>
                     <w:p>
@@ -6797,108 +7269,7 @@
         <mc:AlternateContent>
           <mc:Choice Requires="wps">
             <w:drawing>
-              <wp:anchor distT="45720" distB="45720" distL="114300" distR="114300" simplePos="0" relativeHeight="251743232" behindDoc="0" locked="0" layoutInCell="1" allowOverlap="1" wp14:anchorId="44BFAC03" wp14:editId="69290639">
-                <wp:simplePos x="0" y="0"/>
-                <wp:positionH relativeFrom="margin">
-                  <wp:align>right</wp:align>
-                </wp:positionH>
-                <wp:positionV relativeFrom="paragraph">
-                  <wp:posOffset>1818005</wp:posOffset>
-                </wp:positionV>
-                <wp:extent cx="1409700" cy="276225"/>
-                <wp:effectExtent l="0" t="0" r="19050" b="28575"/>
-                <wp:wrapSquare wrapText="bothSides"/>
-                <wp:docPr id="251543769" name="Cuadro de texto 2"/>
-                <wp:cNvGraphicFramePr>
-                  <a:graphicFrameLocks xmlns:a="http://schemas.openxmlformats.org/drawingml/2006/main"/>
-                </wp:cNvGraphicFramePr>
-                <a:graphic xmlns:a="http://schemas.openxmlformats.org/drawingml/2006/main">
-                  <a:graphicData uri="http://schemas.microsoft.com/office/word/2010/wordprocessingShape">
-                    <wps:wsp>
-                      <wps:cNvSpPr txBox="1">
-                        <a:spLocks noChangeArrowheads="1"/>
-                      </wps:cNvSpPr>
-                      <wps:spPr bwMode="auto">
-                        <a:xfrm>
-                          <a:off x="0" y="0"/>
-                          <a:ext cx="1409700" cy="276225"/>
-                        </a:xfrm>
-                        <a:prstGeom prst="rect">
-                          <a:avLst/>
-                        </a:prstGeom>
-                        <a:solidFill>
-                          <a:srgbClr val="FFFFFF"/>
-                        </a:solidFill>
-                        <a:ln w="9525">
-                          <a:solidFill>
-                            <a:srgbClr val="000000"/>
-                          </a:solidFill>
-                          <a:miter lim="800000"/>
-                          <a:headEnd/>
-                          <a:tailEnd/>
-                        </a:ln>
-                      </wps:spPr>
-                      <wps:txbx>
-                        <w:txbxContent>
-                          <w:p>
-                            <w:pPr>
-                              <w:rPr>
-                                <w:lang w:val="es-ES"/>
-                              </w:rPr>
-                            </w:pPr>
-                            <w:r>
-                              <w:t>Innovator, Generic</w:t>
-                            </w:r>
-                          </w:p>
-                        </w:txbxContent>
-                      </wps:txbx>
-                      <wps:bodyPr rot="0" vert="horz" wrap="square" lIns="91440" tIns="45720" rIns="91440" bIns="45720" anchor="t" anchorCtr="0">
-                        <a:noAutofit/>
-                      </wps:bodyPr>
-                    </wps:wsp>
-                  </a:graphicData>
-                </a:graphic>
-                <wp14:sizeRelH relativeFrom="margin">
-                  <wp14:pctWidth>0</wp14:pctWidth>
-                </wp14:sizeRelH>
-                <wp14:sizeRelV relativeFrom="margin">
-                  <wp14:pctHeight>0</wp14:pctHeight>
-                </wp14:sizeRelV>
-              </wp:anchor>
-            </w:drawing>
-          </mc:Choice>
-          <mc:Fallback>
-            <w:pict>
-              <v:shape w14:anchorId="44BFAC03" id="_x0000_s1054" type="#_x0000_t202" style="position:absolute;margin-left:59.8pt;margin-top:143.15pt;width:111pt;height:21.75pt;z-index:251743232;visibility:visible;mso-wrap-style:square;mso-width-percent:0;mso-height-percent:0;mso-wrap-distance-left:9pt;mso-wrap-distance-top:3.6pt;mso-wrap-distance-right:9pt;mso-wrap-distance-bottom:3.6pt;mso-position-horizontal:right;mso-position-horizontal-relative:margin;mso-position-vertical:absolute;mso-position-vertical-relative:text;mso-width-percent:0;mso-height-percent:0;mso-width-relative:margin;mso-height-relative:margin;v-text-anchor:top" o:gfxdata="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">
-                <v:textbox>
-                  <w:txbxContent>
-                    <w:p>
-                      <w:pPr>
-                        <w:rPr>
-                          <w:lang w:val="es-ES"/>
-                        </w:rPr>
-                      </w:pPr>
-                      <w:r>
-                        <w:t>Innovator, Generic</w:t>
-                      </w:r>
-                    </w:p>
-                  </w:txbxContent>
-                </v:textbox>
-                <w10:wrap type="square" anchorx="margin"/>
-              </v:shape>
-            </w:pict>
-          </mc:Fallback>
-        </mc:AlternateContent>
-      </w:r>
-      <w:r>
-        <w:rPr>
-          <w:rFonts w:ascii="Segoe UI Emoji" w:hAnsi="Segoe UI Emoji" w:cs="Segoe UI Emoji"/>
-          <w:noProof/>
-        </w:rPr>
-        <mc:AlternateContent>
-          <mc:Choice Requires="wps">
-            <w:drawing>
-              <wp:anchor distT="0" distB="0" distL="114300" distR="114300" simplePos="0" relativeHeight="251738112" behindDoc="0" locked="0" layoutInCell="1" allowOverlap="1" wp14:anchorId="5AD97E20" wp14:editId="2BD4F67C">
+              <wp:anchor distT="0" distB="0" distL="114300" distR="114300" simplePos="0" relativeHeight="251738112" behindDoc="0" locked="0" layoutInCell="1" allowOverlap="1" wp14:anchorId="5AD97E20" wp14:editId="40476EC1">
                 <wp:simplePos x="0" y="0"/>
                 <wp:positionH relativeFrom="column">
                   <wp:posOffset>7358380</wp:posOffset>
@@ -6961,7 +7332,7 @@
           </mc:Choice>
           <mc:Fallback>
             <w:pict>
-              <v:rect w14:anchorId="6E16EE2A" id="Rectángulo 1" o:spid="_x0000_s1026" style="position:absolute;margin-left:579.4pt;margin-top:103.7pt;width:128.25pt;height:291pt;z-index:251738112;visibility:visible;mso-wrap-style:square;mso-width-percent:0;mso-height-percent:0;mso-wrap-distance-left:9pt;mso-wrap-distance-top:0;mso-wrap-distance-right:9pt;mso-wrap-distance-bottom:0;mso-position-horizontal:absolute;mso-position-horizontal-relative:text;mso-position-vertical:absolute;mso-position-vertical-relative:text;mso-width-percent:0;mso-height-percent:0;mso-width-relative:margin;mso-height-relative:margin;v-text-anchor:middle" o:gfxdata="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" filled="f" strokecolor="#030e13 [484]" strokeweight="1pt"/>
+              <v:rect w14:anchorId="61C15275" id="Rectángulo 1" o:spid="_x0000_s1026" style="position:absolute;margin-left:579.4pt;margin-top:103.7pt;width:128.25pt;height:291pt;z-index:251738112;visibility:visible;mso-wrap-style:square;mso-width-percent:0;mso-height-percent:0;mso-wrap-distance-left:9pt;mso-wrap-distance-top:0;mso-wrap-distance-right:9pt;mso-wrap-distance-bottom:0;mso-position-horizontal:absolute;mso-position-horizontal-relative:text;mso-position-vertical:absolute;mso-position-vertical-relative:text;mso-width-percent:0;mso-height-percent:0;mso-width-relative:margin;mso-height-relative:margin;v-text-anchor:middle" o:gfxdata="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" filled="f" strokecolor="#030e13 [484]" strokeweight="1pt"/>
             </w:pict>
           </mc:Fallback>
         </mc:AlternateContent>
@@ -7070,7 +7441,7 @@
                                           <pic:cNvPicPr/>
                                         </pic:nvPicPr>
                                         <pic:blipFill>
-                                          <a:blip r:embed="rId9"/>
+                                          <a:blip r:embed="rId10"/>
                                           <a:stretch>
                                             <a:fillRect/>
                                           </a:stretch>
@@ -7110,7 +7481,7 @@
           </mc:Choice>
           <mc:Fallback>
             <w:pict>
-              <v:shape w14:anchorId="42A3F2A7" id="_x0000_s1055" type="#_x0000_t202" style="position:absolute;margin-left:265.15pt;margin-top:102.9pt;width:300.75pt;height:293.25pt;z-index:251747328;visibility:visible;mso-wrap-style:square;mso-width-percent:0;mso-height-percent:0;mso-wrap-distance-left:9pt;mso-wrap-distance-top:3.6pt;mso-wrap-distance-right:9pt;mso-wrap-distance-bottom:3.6pt;mso-position-horizontal:absolute;mso-position-horizontal-relative:margin;mso-position-vertical:absolute;mso-position-vertical-relative:text;mso-width-percent:0;mso-height-percent:0;mso-width-relative:margin;mso-height-relative:margin;v-text-anchor:top" o:gfxdata="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" strokecolor="black [3213]">
+              <v:shape w14:anchorId="42A3F2A7" id="_x0000_s1053" type="#_x0000_t202" style="position:absolute;margin-left:265.15pt;margin-top:102.9pt;width:300.75pt;height:293.25pt;z-index:251747328;visibility:visible;mso-wrap-style:square;mso-width-percent:0;mso-height-percent:0;mso-wrap-distance-left:9pt;mso-wrap-distance-top:3.6pt;mso-wrap-distance-right:9pt;mso-wrap-distance-bottom:3.6pt;mso-position-horizontal:absolute;mso-position-horizontal-relative:margin;mso-position-vertical:absolute;mso-position-vertical-relative:text;mso-width-percent:0;mso-height-percent:0;mso-width-relative:margin;mso-height-relative:margin;v-text-anchor:top" o:gfxdata="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" strokecolor="black [3213]">
                 <v:textbox>
                   <w:txbxContent>
                     <w:p>
@@ -7166,7 +7537,7 @@
                                     <pic:cNvPicPr/>
                                   </pic:nvPicPr>
                                   <pic:blipFill>
-                                    <a:blip r:embed="rId9"/>
+                                    <a:blip r:embed="rId10"/>
                                     <a:stretch>
                                       <a:fillRect/>
                                     </a:stretch>
@@ -7284,7 +7655,15 @@
                                 <w:sz w:val="28"/>
                                 <w:szCs w:val="28"/>
                               </w:rPr>
-                              <w:t>5% YTD</w:t>
+                              <w:t xml:space="preserve">5% </w:t>
+                            </w:r>
+                            <w:r>
+                              <w:rPr>
+                                <w:color w:val="EE0000"/>
+                                <w:sz w:val="28"/>
+                                <w:szCs w:val="28"/>
+                              </w:rPr>
+                              <w:t>LY</w:t>
                             </w:r>
                           </w:p>
                           <w:p>
@@ -7316,7 +7695,7 @@
           </mc:Choice>
           <mc:Fallback>
             <w:pict>
-              <v:shape w14:anchorId="74F951A3" id="_x0000_s1056" type="#_x0000_t202" style="position:absolute;margin-left:479.15pt;margin-top:46.45pt;width:121.3pt;height:32.25pt;z-index:251737088;visibility:visible;mso-wrap-style:square;mso-width-percent:0;mso-height-percent:0;mso-wrap-distance-left:9pt;mso-wrap-distance-top:3.6pt;mso-wrap-distance-right:9pt;mso-wrap-distance-bottom:3.6pt;mso-position-horizontal:absolute;mso-position-horizontal-relative:margin;mso-position-vertical:absolute;mso-position-vertical-relative:text;mso-width-percent:0;mso-height-percent:0;mso-width-relative:margin;mso-height-relative:margin;v-text-anchor:top" o:gfxdata="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" stroked="f">
+              <v:shape w14:anchorId="74F951A3" id="_x0000_s1054" type="#_x0000_t202" style="position:absolute;margin-left:479.15pt;margin-top:46.45pt;width:121.3pt;height:32.25pt;z-index:251737088;visibility:visible;mso-wrap-style:square;mso-width-percent:0;mso-height-percent:0;mso-wrap-distance-left:9pt;mso-wrap-distance-top:3.6pt;mso-wrap-distance-right:9pt;mso-wrap-distance-bottom:3.6pt;mso-position-horizontal:absolute;mso-position-horizontal-relative:margin;mso-position-vertical:absolute;mso-position-vertical-relative:text;mso-width-percent:0;mso-height-percent:0;mso-width-relative:margin;mso-height-relative:margin;v-text-anchor:top" o:gfxdata="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" stroked="f">
                 <v:textbox>
                   <w:txbxContent>
                     <w:p>
@@ -7359,7 +7738,15 @@
                           <w:sz w:val="28"/>
                           <w:szCs w:val="28"/>
                         </w:rPr>
-                        <w:t>5% YTD</w:t>
+                        <w:t xml:space="preserve">5% </w:t>
+                      </w:r>
+                      <w:r>
+                        <w:rPr>
+                          <w:color w:val="EE0000"/>
+                          <w:sz w:val="28"/>
+                          <w:szCs w:val="28"/>
+                        </w:rPr>
+                        <w:t>LY</w:t>
                       </w:r>
                     </w:p>
                     <w:p>
@@ -7456,7 +7843,15 @@
                                 <w:sz w:val="28"/>
                                 <w:szCs w:val="28"/>
                               </w:rPr>
-                              <w:t>+1.5% YTD</w:t>
+                              <w:t xml:space="preserve">+1.5% </w:t>
+                            </w:r>
+                            <w:r>
+                              <w:rPr>
+                                <w:color w:val="00B050"/>
+                                <w:sz w:val="28"/>
+                                <w:szCs w:val="28"/>
+                              </w:rPr>
+                              <w:t>LY</w:t>
                             </w:r>
                           </w:p>
                           <w:p>
@@ -7488,7 +7883,7 @@
           </mc:Choice>
           <mc:Fallback>
             <w:pict>
-              <v:shape w14:anchorId="102AECC3" id="_x0000_s1057" type="#_x0000_t202" style="position:absolute;margin-left:247.1pt;margin-top:49.75pt;width:134.65pt;height:32.25pt;z-index:251735040;visibility:visible;mso-wrap-style:square;mso-width-percent:0;mso-height-percent:0;mso-wrap-distance-left:9pt;mso-wrap-distance-top:3.6pt;mso-wrap-distance-right:9pt;mso-wrap-distance-bottom:3.6pt;mso-position-horizontal:absolute;mso-position-horizontal-relative:margin;mso-position-vertical:absolute;mso-position-vertical-relative:text;mso-width-percent:0;mso-height-percent:0;mso-width-relative:margin;mso-height-relative:margin;v-text-anchor:top" o:gfxdata="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" stroked="f">
+              <v:shape w14:anchorId="102AECC3" id="_x0000_s1055" type="#_x0000_t202" style="position:absolute;margin-left:247.1pt;margin-top:49.75pt;width:134.65pt;height:32.25pt;z-index:251735040;visibility:visible;mso-wrap-style:square;mso-width-percent:0;mso-height-percent:0;mso-wrap-distance-left:9pt;mso-wrap-distance-top:3.6pt;mso-wrap-distance-right:9pt;mso-wrap-distance-bottom:3.6pt;mso-position-horizontal:absolute;mso-position-horizontal-relative:margin;mso-position-vertical:absolute;mso-position-vertical-relative:text;mso-width-percent:0;mso-height-percent:0;mso-width-relative:margin;mso-height-relative:margin;v-text-anchor:top" o:gfxdata="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" stroked="f">
                 <v:textbox>
                   <w:txbxContent>
                     <w:p>
@@ -7518,7 +7913,15 @@
                           <w:sz w:val="28"/>
                           <w:szCs w:val="28"/>
                         </w:rPr>
-                        <w:t>+1.5% YTD</w:t>
+                        <w:t xml:space="preserve">+1.5% </w:t>
+                      </w:r>
+                      <w:r>
+                        <w:rPr>
+                          <w:color w:val="00B050"/>
+                          <w:sz w:val="28"/>
+                          <w:szCs w:val="28"/>
+                        </w:rPr>
+                        <w:t>LY</w:t>
                       </w:r>
                     </w:p>
                     <w:p>
@@ -7624,7 +8027,7 @@
           </mc:Choice>
           <mc:Fallback>
             <w:pict>
-              <v:shape w14:anchorId="082A648C" id="_x0000_s1058" type="#_x0000_t202" style="position:absolute;margin-left:243.15pt;margin-top:22.45pt;width:213.75pt;height:63.15pt;z-index:251731968;visibility:visible;mso-wrap-style:square;mso-width-percent:0;mso-height-percent:0;mso-wrap-distance-left:9pt;mso-wrap-distance-top:3.6pt;mso-wrap-distance-right:9pt;mso-wrap-distance-bottom:3.6pt;mso-position-horizontal:absolute;mso-position-horizontal-relative:margin;mso-position-vertical:absolute;mso-position-vertical-relative:text;mso-width-percent:0;mso-height-percent:0;mso-width-relative:margin;mso-height-relative:margin;v-text-anchor:top" o:gfxdata="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" stroked="f">
+              <v:shape w14:anchorId="082A648C" id="_x0000_s1056" type="#_x0000_t202" style="position:absolute;margin-left:243.15pt;margin-top:22.45pt;width:213.75pt;height:63.15pt;z-index:251731968;visibility:visible;mso-wrap-style:square;mso-width-percent:0;mso-height-percent:0;mso-wrap-distance-left:9pt;mso-wrap-distance-top:3.6pt;mso-wrap-distance-right:9pt;mso-wrap-distance-bottom:3.6pt;mso-position-horizontal:absolute;mso-position-horizontal-relative:margin;mso-position-vertical:absolute;mso-position-vertical-relative:text;mso-width-percent:0;mso-height-percent:0;mso-width-relative:margin;mso-height-relative:margin;v-text-anchor:top" o:gfxdata="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" stroked="f">
                 <v:textbox>
                   <w:txbxContent>
                     <w:p>
@@ -7740,7 +8143,7 @@
           </mc:Choice>
           <mc:Fallback>
             <w:pict>
-              <v:shape w14:anchorId="5DB8E94F" id="_x0000_s1059" type="#_x0000_t202" style="position:absolute;margin-left:14.65pt;margin-top:48.8pt;width:75.75pt;height:32.25pt;z-index:251732992;visibility:visible;mso-wrap-style:square;mso-width-percent:0;mso-height-percent:0;mso-wrap-distance-left:9pt;mso-wrap-distance-top:3.6pt;mso-wrap-distance-right:9pt;mso-wrap-distance-bottom:3.6pt;mso-position-horizontal:absolute;mso-position-horizontal-relative:margin;mso-position-vertical:absolute;mso-position-vertical-relative:text;mso-width-percent:0;mso-height-percent:0;mso-width-relative:margin;mso-height-relative:margin;v-text-anchor:top" o:gfxdata="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" stroked="f">
+              <v:shape w14:anchorId="5DB8E94F" id="_x0000_s1057" type="#_x0000_t202" style="position:absolute;margin-left:14.65pt;margin-top:48.8pt;width:75.75pt;height:32.25pt;z-index:251732992;visibility:visible;mso-wrap-style:square;mso-width-percent:0;mso-height-percent:0;mso-wrap-distance-left:9pt;mso-wrap-distance-top:3.6pt;mso-wrap-distance-right:9pt;mso-wrap-distance-bottom:3.6pt;mso-position-horizontal:absolute;mso-position-horizontal-relative:margin;mso-position-vertical:absolute;mso-position-vertical-relative:text;mso-width-percent:0;mso-height-percent:0;mso-width-relative:margin;mso-height-relative:margin;v-text-anchor:top" o:gfxdata="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" stroked="f">
                 <v:textbox>
                   <w:txbxContent>
                     <w:p>
@@ -7856,7 +8259,7 @@
           </mc:Choice>
           <mc:Fallback>
             <w:pict>
-              <v:shape w14:anchorId="2A3C46BA" id="_x0000_s1060" type="#_x0000_t202" style="position:absolute;margin-left:473.65pt;margin-top:26.45pt;width:213.75pt;height:58.5pt;z-index:-251580416;visibility:visible;mso-wrap-style:square;mso-width-percent:0;mso-height-percent:0;mso-wrap-distance-left:9pt;mso-wrap-distance-top:3.6pt;mso-wrap-distance-right:9pt;mso-wrap-distance-bottom:3.6pt;mso-position-horizontal:absolute;mso-position-horizontal-relative:margin;mso-position-vertical:absolute;mso-position-vertical-relative:text;mso-width-percent:0;mso-height-percent:0;mso-width-relative:margin;mso-height-relative:margin;v-text-anchor:top" o:gfxdata="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" stroked="f">
+              <v:shape w14:anchorId="2A3C46BA" id="_x0000_s1058" type="#_x0000_t202" style="position:absolute;margin-left:473.65pt;margin-top:26.45pt;width:213.75pt;height:58.5pt;z-index:-251580416;visibility:visible;mso-wrap-style:square;mso-width-percent:0;mso-height-percent:0;mso-wrap-distance-left:9pt;mso-wrap-distance-top:3.6pt;mso-wrap-distance-right:9pt;mso-wrap-distance-bottom:3.6pt;mso-position-horizontal:absolute;mso-position-horizontal-relative:margin;mso-position-vertical:absolute;mso-position-vertical-relative:text;mso-width-percent:0;mso-height-percent:0;mso-width-relative:margin;mso-height-relative:margin;v-text-anchor:top" o:gfxdata="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" stroked="f">
                 <v:textbox>
                   <w:txbxContent>
                     <w:p>
@@ -8223,7 +8626,7 @@
                                           </pic:cNvPicPr>
                                         </pic:nvPicPr>
                                         <pic:blipFill>
-                                          <a:blip r:embed="rId10">
+                                          <a:blip r:embed="rId9">
                                             <a:extLst>
                                               <a:ext uri="{28A0092B-C50C-407E-A947-70E740481C1C}">
                                                 <a14:useLocalDpi xmlns:a14="http://schemas.microsoft.com/office/drawing/2010/main" val="0"/>
@@ -8290,7 +8693,7 @@
           </mc:Choice>
           <mc:Fallback>
             <w:pict>
-              <v:shape w14:anchorId="7EFC1796" id="_x0000_s1061" type="#_x0000_t202" style="position:absolute;margin-left:5.65pt;margin-top:73.45pt;width:247.5pt;height:296.25pt;z-index:251746304;visibility:visible;mso-wrap-style:square;mso-width-percent:0;mso-height-percent:0;mso-wrap-distance-left:9pt;mso-wrap-distance-top:3.6pt;mso-wrap-distance-right:9pt;mso-wrap-distance-bottom:3.6pt;mso-position-horizontal:absolute;mso-position-horizontal-relative:margin;mso-position-vertical:absolute;mso-position-vertical-relative:text;mso-width-percent:0;mso-height-percent:0;mso-width-relative:margin;mso-height-relative:margin;v-text-anchor:top" o:gfxdata="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" strokecolor="black [3213]">
+              <v:shape w14:anchorId="7EFC1796" id="_x0000_s1059" type="#_x0000_t202" style="position:absolute;margin-left:5.65pt;margin-top:73.45pt;width:247.5pt;height:296.25pt;z-index:251746304;visibility:visible;mso-wrap-style:square;mso-width-percent:0;mso-height-percent:0;mso-wrap-distance-left:9pt;mso-wrap-distance-top:3.6pt;mso-wrap-distance-right:9pt;mso-wrap-distance-bottom:3.6pt;mso-position-horizontal:absolute;mso-position-horizontal-relative:margin;mso-position-vertical:absolute;mso-position-vertical-relative:text;mso-width-percent:0;mso-height-percent:0;mso-width-relative:margin;mso-height-relative:margin;v-text-anchor:top" o:gfxdata="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" strokecolor="black [3213]">
                 <v:textbox>
                   <w:txbxContent>
                     <w:p>
@@ -8350,7 +8753,7 @@
                                     </pic:cNvPicPr>
                                   </pic:nvPicPr>
                                   <pic:blipFill>
-                                    <a:blip r:embed="rId10">
+                                    <a:blip r:embed="rId9">
                                       <a:extLst>
                                         <a:ext uri="{28A0092B-C50C-407E-A947-70E740481C1C}">
                                           <a14:useLocalDpi xmlns:a14="http://schemas.microsoft.com/office/drawing/2010/main" val="0"/>
@@ -8490,7 +8893,7 @@
           </mc:Choice>
           <mc:Fallback>
             <w:pict>
-              <v:shape w14:anchorId="77344CE2" id="_x0000_s1062" type="#_x0000_t202" style="position:absolute;margin-left:594.4pt;margin-top:79.45pt;width:84pt;height:18pt;z-index:251741184;visibility:visible;mso-wrap-style:square;mso-width-percent:0;mso-height-percent:0;mso-wrap-distance-left:9pt;mso-wrap-distance-top:3.6pt;mso-wrap-distance-right:9pt;mso-wrap-distance-bottom:3.6pt;mso-position-horizontal:absolute;mso-position-horizontal-relative:text;mso-position-vertical:absolute;mso-position-vertical-relative:text;mso-width-percent:0;mso-height-percent:0;mso-width-relative:margin;mso-height-relative:margin;v-text-anchor:top" o:gfxdata="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" stroked="f">
+              <v:shape w14:anchorId="77344CE2" id="_x0000_s1060" type="#_x0000_t202" style="position:absolute;margin-left:594.4pt;margin-top:79.45pt;width:84pt;height:18pt;z-index:251741184;visibility:visible;mso-wrap-style:square;mso-width-percent:0;mso-height-percent:0;mso-wrap-distance-left:9pt;mso-wrap-distance-top:3.6pt;mso-wrap-distance-right:9pt;mso-wrap-distance-bottom:3.6pt;mso-position-horizontal:absolute;mso-position-horizontal-relative:text;mso-position-vertical:absolute;mso-position-vertical-relative:text;mso-width-percent:0;mso-height-percent:0;mso-width-relative:margin;mso-height-relative:margin;v-text-anchor:top" o:gfxdata="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" stroked="f">
                 <v:textbox>
                   <w:txbxContent>
                     <w:p>
@@ -8604,7 +9007,7 @@
           </mc:Choice>
           <mc:Fallback>
             <w:pict>
-              <v:shape w14:anchorId="735FF48F" id="_x0000_s1063" type="#_x0000_t202" style="position:absolute;margin-left:9.4pt;margin-top:.7pt;width:213.75pt;height:58.5pt;z-index:251730944;visibility:visible;mso-wrap-style:square;mso-width-percent:0;mso-height-percent:0;mso-wrap-distance-left:9pt;mso-wrap-distance-top:3.6pt;mso-wrap-distance-right:9pt;mso-wrap-distance-bottom:3.6pt;mso-position-horizontal:absolute;mso-position-horizontal-relative:text;mso-position-vertical:absolute;mso-position-vertical-relative:text;mso-width-percent:0;mso-height-percent:0;mso-width-relative:margin;mso-height-relative:margin;v-text-anchor:top" o:gfxdata="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" stroked="f">
+              <v:shape w14:anchorId="735FF48F" id="_x0000_s1061" type="#_x0000_t202" style="position:absolute;margin-left:9.4pt;margin-top:.7pt;width:213.75pt;height:58.5pt;z-index:251730944;visibility:visible;mso-wrap-style:square;mso-width-percent:0;mso-height-percent:0;mso-wrap-distance-left:9pt;mso-wrap-distance-top:3.6pt;mso-wrap-distance-right:9pt;mso-wrap-distance-bottom:3.6pt;mso-position-horizontal:absolute;mso-position-horizontal-relative:text;mso-position-vertical:absolute;mso-position-vertical-relative:text;mso-width-percent:0;mso-height-percent:0;mso-width-relative:margin;mso-height-relative:margin;v-text-anchor:top" o:gfxdata="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" stroked="f">
                 <v:textbox>
                   <w:txbxContent>
                     <w:p>

</xml_diff>